<commit_message>
Expand preprint to full-length manuscript (Background/Results/Discussion prose + Table 1) and regenerate docx
</commit_message>
<xml_diff>
--- a/docs/VIGIL_preprint.docx
+++ b/docs/VIGIL_preprint.docx
@@ -28,7 +28,7 @@
         </w:p>
       </w:sdtContent>
     </w:sdt>
-    <w:bookmarkStart w:id="25" w:name="X600a2618c5c30508b60a79d3c8d16e8d9a48992"/>
+    <w:bookmarkStart w:id="28" w:name="X600a2618c5c30508b60a79d3c8d16e8d9a48992"/>
     <w:p>
       <w:pPr>
         <w:pStyle w:val="Heading1"/>
@@ -64,7 +64,19 @@
         <w:t xml:space="preserve"> </w:t>
       </w:r>
       <w:r>
-        <w:t xml:space="preserve">reference list. Numbers here are from a snapshot of</w:t>
+        <w:t xml:space="preserve">citations marked</w:t>
+      </w:r>
+      <w:r>
+        <w:t xml:space="preserve"> </w:t>
+      </w:r>
+      <w:r>
+        <w:rPr>
+          <w:rStyle w:val="VerbatimChar"/>
+        </w:rPr>
+        <w:t xml:space="preserve">[ref]</w:t>
+      </w:r>
+      <w:r>
+        <w:t xml:space="preserve">. Numbers here are from a snapshot of</w:t>
       </w:r>
       <w:r>
         <w:t xml:space="preserve"> </w:t>
@@ -74,7 +86,21 @@
           <w:b/>
           <w:bCs/>
         </w:rPr>
-        <w:t xml:space="preserve">2,075 documents</w:t>
+        <w:t xml:space="preserve">2,075</w:t>
+      </w:r>
+      <w:r>
+        <w:rPr>
+          <w:b/>
+          <w:bCs/>
+        </w:rPr>
+        <w:t xml:space="preserve"> </w:t>
+      </w:r>
+      <w:r>
+        <w:rPr>
+          <w:b/>
+          <w:bCs/>
+        </w:rPr>
+        <w:t xml:space="preserve">documents</w:t>
       </w:r>
       <w:r>
         <w:t xml:space="preserve">.</w:t>
@@ -200,37 +226,37 @@
         <w:t xml:space="preserve"> </w:t>
       </w:r>
       <w:r>
-        <w:t xml:space="preserve">large volumes of open-source text — outbreak alerts, literature, trial</w:t>
-      </w:r>
-      <w:r>
-        <w:t xml:space="preserve"> </w:t>
-      </w:r>
-      <w:r>
-        <w:t xml:space="preserve">registries, surveillance reports — but converting them into structured,</w:t>
-      </w:r>
-      <w:r>
-        <w:t xml:space="preserve"> </w:t>
-      </w:r>
-      <w:r>
-        <w:t xml:space="preserve">comparable intelligence is largely manual. Existing event-based surveillance</w:t>
-      </w:r>
-      <w:r>
-        <w:t xml:space="preserve"> </w:t>
-      </w:r>
-      <w:r>
-        <w:t xml:space="preserve">systems focus on outbreak detection rather than AMR-specific, structured</w:t>
-      </w:r>
-      <w:r>
-        <w:t xml:space="preserve"> </w:t>
-      </w:r>
-      <w:r>
-        <w:t xml:space="preserve">extraction, and few are open, reproducible, or benchmarked against reference</w:t>
-      </w:r>
-      <w:r>
-        <w:t xml:space="preserve"> </w:t>
-      </w:r>
-      <w:r>
-        <w:t xml:space="preserve">data.</w:t>
+        <w:t xml:space="preserve">large volumes of open-source text — outbreak alerts, peer-reviewed and preprint</w:t>
+      </w:r>
+      <w:r>
+        <w:t xml:space="preserve"> </w:t>
+      </w:r>
+      <w:r>
+        <w:t xml:space="preserve">literature, trial registries, and surveillance reports — yet converting this</w:t>
+      </w:r>
+      <w:r>
+        <w:t xml:space="preserve"> </w:t>
+      </w:r>
+      <w:r>
+        <w:t xml:space="preserve">text into structured, comparable intelligence remains largely manual. Existing</w:t>
+      </w:r>
+      <w:r>
+        <w:t xml:space="preserve"> </w:t>
+      </w:r>
+      <w:r>
+        <w:t xml:space="preserve">open-source epidemic-intelligence systems are optimised for outbreak event</w:t>
+      </w:r>
+      <w:r>
+        <w:t xml:space="preserve"> </w:t>
+      </w:r>
+      <w:r>
+        <w:t xml:space="preserve">detection rather than AMR-specific structured extraction, and few are fully open,</w:t>
+      </w:r>
+      <w:r>
+        <w:t xml:space="preserve"> </w:t>
+      </w:r>
+      <w:r>
+        <w:t xml:space="preserve">reproducible, or explicitly benchmarked against reference surveillance data.</w:t>
       </w:r>
     </w:p>
     <w:p>
@@ -242,73 +268,31 @@
           <w:b/>
           <w:bCs/>
         </w:rPr>
-        <w:t xml:space="preserve">Implementation.</w:t>
-      </w:r>
-      <w:r>
-        <w:t xml:space="preserve"> </w:t>
-      </w:r>
-      <w:r>
-        <w:t xml:space="preserve">VIGIL is a free, open-source platform that automatically</w:t>
-      </w:r>
-      <w:r>
-        <w:t xml:space="preserve"> </w:t>
-      </w:r>
-      <w:r>
-        <w:t xml:space="preserve">collects documents daily from eight source families (WHO Disease Outbreak News,</w:t>
-      </w:r>
-      <w:r>
-        <w:t xml:space="preserve"> </w:t>
-      </w:r>
-      <w:r>
-        <w:t xml:space="preserve">CDC, ECDC, UK Health Security Agency, PubMed, bioRxiv/medRxiv via Europe PMC,</w:t>
-      </w:r>
-      <w:r>
-        <w:t xml:space="preserve"> </w:t>
-      </w:r>
-      <w:r>
-        <w:t xml:space="preserve">ClinicalTrials.gov, and WHO GLASS/GHO), extracts a structured schema (pathogen,</w:t>
-      </w:r>
-      <w:r>
-        <w:t xml:space="preserve"> </w:t>
-      </w:r>
-      <w:r>
-        <w:t xml:space="preserve">resistance gene/mechanism, antibiotic, disease, country, event type) using an</w:t>
-      </w:r>
-      <w:r>
-        <w:t xml:space="preserve"> </w:t>
-      </w:r>
-      <w:r>
-        <w:t xml:space="preserve">always-on rule-based extractor and an optional large language model (LLM),</w:t>
-      </w:r>
-      <w:r>
-        <w:t xml:space="preserve"> </w:t>
-      </w:r>
-      <w:r>
-        <w:t xml:space="preserve">builds a co-occurrence knowledge graph, and computes trend, emerging-signal,</w:t>
-      </w:r>
-      <w:r>
-        <w:t xml:space="preserve"> </w:t>
-      </w:r>
-      <w:r>
-        <w:t xml:space="preserve">forecasting, novelty, and country-risk analytics. All analytics are validated</w:t>
-      </w:r>
-      <w:r>
-        <w:t xml:space="preserve"> </w:t>
-      </w:r>
-      <w:r>
-        <w:t xml:space="preserve">against WHO GHO/GLASS resistance indicators, which the platform ingests</w:t>
-      </w:r>
-      <w:r>
-        <w:t xml:space="preserve"> </w:t>
-      </w:r>
-      <w:r>
-        <w:t xml:space="preserve">automatically. The stack (Python, SQLite, Streamlit) is fully reproducible and</w:t>
-      </w:r>
-      <w:r>
-        <w:t xml:space="preserve"> </w:t>
-      </w:r>
-      <w:r>
-        <w:t xml:space="preserve">deploys for free; daily updates run via continuous integration.</w:t>
+        <w:t xml:space="preserve">Objective.</w:t>
+      </w:r>
+      <w:r>
+        <w:t xml:space="preserve"> </w:t>
+      </w:r>
+      <w:r>
+        <w:t xml:space="preserve">To design, build, and openly release a reproducible platform that</w:t>
+      </w:r>
+      <w:r>
+        <w:t xml:space="preserve"> </w:t>
+      </w:r>
+      <w:r>
+        <w:t xml:space="preserve">automatically collects open-source infectious-disease/AMR text, extracts a</w:t>
+      </w:r>
+      <w:r>
+        <w:t xml:space="preserve"> </w:t>
+      </w:r>
+      <w:r>
+        <w:t xml:space="preserve">structured schema, builds a knowledge graph, and produces validation-first</w:t>
+      </w:r>
+      <w:r>
+        <w:t xml:space="preserve"> </w:t>
+      </w:r>
+      <w:r>
+        <w:t xml:space="preserve">analytics, with an Asia-Pacific (APAC) focus.</w:t>
       </w:r>
     </w:p>
     <w:p>
@@ -320,89 +304,157 @@
           <w:b/>
           <w:bCs/>
         </w:rPr>
-        <w:t xml:space="preserve">Results (proof of concept).</w:t>
-      </w:r>
-      <w:r>
-        <w:t xml:space="preserve"> </w:t>
-      </w:r>
-      <w:r>
-        <w:t xml:space="preserve">A snapshot of 2,075 documents across seven</w:t>
-      </w:r>
-      <w:r>
-        <w:t xml:space="preserve"> </w:t>
-      </w:r>
-      <w:r>
-        <w:t xml:space="preserve">actively-contributing sources yielded 31 distinct pathogens, 12 resistance</w:t>
-      </w:r>
-      <w:r>
-        <w:t xml:space="preserve"> </w:t>
-      </w:r>
-      <w:r>
-        <w:t xml:space="preserve">genes/mechanisms, 62 countries and 1,060 knowledge-graph relations, plus 1,005</w:t>
-      </w:r>
-      <w:r>
-        <w:t xml:space="preserve"> </w:t>
-      </w:r>
-      <w:r>
-        <w:t xml:space="preserve">WHO GHO reference resistance values (101 countries, 2016–2023). In a preliminary</w:t>
-      </w:r>
-      <w:r>
-        <w:t xml:space="preserve"> </w:t>
-      </w:r>
-      <w:r>
-        <w:t xml:space="preserve">construct-validity check across 23 countries, raw document volume was essentially</w:t>
-      </w:r>
-      <w:r>
-        <w:t xml:space="preserve"> </w:t>
-      </w:r>
-      <w:r>
-        <w:t xml:space="preserve">uncorrelated with measured MRSA resistance (Spearman ρ = 0.06) whereas a</w:t>
-      </w:r>
-      <w:r>
-        <w:t xml:space="preserve"> </w:t>
-      </w:r>
-      <w:r>
-        <w:t xml:space="preserve">publication-normalised AMR share showed a weak positive association (ρ = 0.28);</w:t>
-      </w:r>
-      <w:r>
-        <w:t xml:space="preserve"> </w:t>
-      </w:r>
-      <w:r>
-        <w:t xml:space="preserve">and literature signal did</w:t>
-      </w:r>
-      <w:r>
-        <w:t xml:space="preserve"> </w:t>
-      </w:r>
+        <w:t xml:space="preserve">Implementation.</w:t>
+      </w:r>
+      <w:r>
+        <w:t xml:space="preserve"> </w:t>
+      </w:r>
+      <w:r>
+        <w:t xml:space="preserve">VIGIL collects documents daily from eight configured source</w:t>
+      </w:r>
+      <w:r>
+        <w:t xml:space="preserve"> </w:t>
+      </w:r>
+      <w:r>
+        <w:t xml:space="preserve">families (WHO Disease Outbreak News, US CDC, ECDC, UK Health Security Agency,</w:t>
+      </w:r>
+      <w:r>
+        <w:t xml:space="preserve"> </w:t>
+      </w:r>
+      <w:r>
+        <w:t xml:space="preserve">PubMed, bioRxiv/medRxiv via Europe PMC, ClinicalTrials.gov, and WHO GLASS/GHO).</w:t>
+      </w:r>
+      <w:r>
+        <w:t xml:space="preserve"> </w:t>
+      </w:r>
+      <w:r>
+        <w:t xml:space="preserve">Each document is processed by an always-on rule-based extractor and an optional</w:t>
+      </w:r>
+      <w:r>
+        <w:t xml:space="preserve"> </w:t>
+      </w:r>
+      <w:r>
+        <w:t xml:space="preserve">large language model (LLM), both returning the same schema (pathogen, resistance</w:t>
+      </w:r>
+      <w:r>
+        <w:t xml:space="preserve"> </w:t>
+      </w:r>
+      <w:r>
+        <w:t xml:space="preserve">gene/mechanism, antibiotic, disease, country, event type). Entity co-occurrence</w:t>
+      </w:r>
+      <w:r>
+        <w:t xml:space="preserve"> </w:t>
+      </w:r>
+      <w:r>
+        <w:t xml:space="preserve">yields a knowledge graph; downstream modules compute growth-rate and</w:t>
+      </w:r>
+      <w:r>
+        <w:t xml:space="preserve"> </w:t>
+      </w:r>
+      <w:r>
+        <w:t xml:space="preserve">emerging-signal detection, weekly-volume forecasting with backtesting, novelty</w:t>
+      </w:r>
+      <w:r>
+        <w:t xml:space="preserve"> </w:t>
+      </w:r>
+      <w:r>
+        <w:t xml:space="preserve">detection, graph queries, a global heatmap, a country risk signal, and an</w:t>
+      </w:r>
+      <w:r>
+        <w:t xml:space="preserve"> </w:t>
+      </w:r>
+      <w:r>
+        <w:t xml:space="preserve">outbreak module. Analytics are validated against WHO GHO/GLASS resistance</w:t>
+      </w:r>
+      <w:r>
+        <w:t xml:space="preserve"> </w:t>
+      </w:r>
+      <w:r>
+        <w:t xml:space="preserve">indicators, which the platform ingests automatically. The stack (Python, SQLite,</w:t>
+      </w:r>
+      <w:r>
+        <w:t xml:space="preserve"> </w:t>
+      </w:r>
+      <w:r>
+        <w:t xml:space="preserve">Streamlit) is free, reproducible, and updates daily via continuous integration.</w:t>
+      </w:r>
+    </w:p>
+    <w:p>
+      <w:pPr>
+        <w:pStyle w:val="BodyText"/>
+      </w:pPr>
       <w:r>
         <w:rPr>
           <w:b/>
           <w:bCs/>
         </w:rPr>
-        <w:t xml:space="preserve">not</w:t>
-      </w:r>
-      <w:r>
-        <w:t xml:space="preserve"> </w:t>
-      </w:r>
-      <w:r>
-        <w:t xml:space="preserve">discriminate which countries had officially</w:t>
-      </w:r>
-      <w:r>
-        <w:t xml:space="preserve"> </w:t>
-      </w:r>
-      <w:r>
-        <w:t xml:space="preserve">reported outbreaks (rank-AUC = 0.16), with outbreaks concentrated in</w:t>
-      </w:r>
-      <w:r>
-        <w:t xml:space="preserve"> </w:t>
-      </w:r>
-      <w:r>
-        <w:t xml:space="preserve">low-literature, lower-resource countries — an illustration of the global</w:t>
-      </w:r>
-      <w:r>
-        <w:t xml:space="preserve"> </w:t>
-      </w:r>
-      <w:r>
-        <w:t xml:space="preserve">surveillance gap that the platform makes measurable.</w:t>
+        <w:t xml:space="preserve">Results.</w:t>
+      </w:r>
+      <w:r>
+        <w:t xml:space="preserve"> </w:t>
+      </w:r>
+      <w:r>
+        <w:t xml:space="preserve">A snapshot of 2,075 documents across seven actively-contributing</w:t>
+      </w:r>
+      <w:r>
+        <w:t xml:space="preserve"> </w:t>
+      </w:r>
+      <w:r>
+        <w:t xml:space="preserve">sources produced 31 distinct pathogens, 12 resistance genes/mechanisms, 62</w:t>
+      </w:r>
+      <w:r>
+        <w:t xml:space="preserve"> </w:t>
+      </w:r>
+      <w:r>
+        <w:t xml:space="preserve">countries, and 1,060 knowledge-graph relations, alongside 1,005 WHO GHO reference</w:t>
+      </w:r>
+      <w:r>
+        <w:t xml:space="preserve"> </w:t>
+      </w:r>
+      <w:r>
+        <w:t xml:space="preserve">resistance values (101 countries, 2016–2023). In a preliminary construct-validity</w:t>
+      </w:r>
+      <w:r>
+        <w:t xml:space="preserve"> </w:t>
+      </w:r>
+      <w:r>
+        <w:t xml:space="preserve">analysis of 23 countries, raw document volume was essentially uncorrelated with</w:t>
+      </w:r>
+      <w:r>
+        <w:t xml:space="preserve"> </w:t>
+      </w:r>
+      <w:r>
+        <w:t xml:space="preserve">measured MRSA bloodstream-infection resistance (Spearman ρ = 0.06), whereas a</w:t>
+      </w:r>
+      <w:r>
+        <w:t xml:space="preserve"> </w:t>
+      </w:r>
+      <w:r>
+        <w:t xml:space="preserve">publication-normalised AMR share showed a weak positive association (ρ = 0.28).</w:t>
+      </w:r>
+      <w:r>
+        <w:t xml:space="preserve"> </w:t>
+      </w:r>
+      <w:r>
+        <w:t xml:space="preserve">Literature signal did not discriminate which of 39 countries had officially</w:t>
+      </w:r>
+      <w:r>
+        <w:t xml:space="preserve"> </w:t>
+      </w:r>
+      <w:r>
+        <w:t xml:space="preserve">reported outbreaks (rank-AUC = 0.16); reported outbreaks concentrated in</w:t>
+      </w:r>
+      <w:r>
+        <w:t xml:space="preserve"> </w:t>
+      </w:r>
+      <w:r>
+        <w:t xml:space="preserve">low-literature, lower-resource settings — a quantification of the global</w:t>
+      </w:r>
+      <w:r>
+        <w:t xml:space="preserve"> </w:t>
+      </w:r>
+      <w:r>
+        <w:t xml:space="preserve">surveillance gap.</w:t>
       </w:r>
     </w:p>
     <w:p>
@@ -420,25 +472,25 @@
         <w:t xml:space="preserve"> </w:t>
       </w:r>
       <w:r>
-        <w:t xml:space="preserve">VIGIL provides an open, reproducible, validation-first</w:t>
-      </w:r>
-      <w:r>
-        <w:t xml:space="preserve"> </w:t>
-      </w:r>
-      <w:r>
-        <w:t xml:space="preserve">infrastructure for AMR/infectious-disease intelligence and a foundation for</w:t>
-      </w:r>
-      <w:r>
-        <w:t xml:space="preserve"> </w:t>
-      </w:r>
-      <w:r>
-        <w:t xml:space="preserve">downstream methodological research (LLM extraction benchmarking, early-warning</w:t>
-      </w:r>
-      <w:r>
-        <w:t xml:space="preserve"> </w:t>
-      </w:r>
-      <w:r>
-        <w:t xml:space="preserve">modelling). It is openly available with a citable DOI.</w:t>
+        <w:t xml:space="preserve">VIGIL is an open, reproducible, validation-first infrastructure</w:t>
+      </w:r>
+      <w:r>
+        <w:t xml:space="preserve"> </w:t>
+      </w:r>
+      <w:r>
+        <w:t xml:space="preserve">for AMR and infectious-disease intelligence, and a foundation for downstream</w:t>
+      </w:r>
+      <w:r>
+        <w:t xml:space="preserve"> </w:t>
+      </w:r>
+      <w:r>
+        <w:t xml:space="preserve">methodological research including clinician-annotated LLM extraction benchmarking</w:t>
+      </w:r>
+      <w:r>
+        <w:t xml:space="preserve"> </w:t>
+      </w:r>
+      <w:r>
+        <w:t xml:space="preserve">and early-warning modelling. It is openly available with a citable DOI.</w:t>
       </w:r>
     </w:p>
     <w:p>
@@ -456,13 +508,13 @@
         <w:t xml:space="preserve"> </w:t>
       </w:r>
       <w:r>
-        <w:t xml:space="preserve">antimicrobial resistance; infectious disease surveillance;</w:t>
-      </w:r>
-      <w:r>
-        <w:t xml:space="preserve"> </w:t>
-      </w:r>
-      <w:r>
-        <w:t xml:space="preserve">large language models; information extraction; knowledge graph; open data.</w:t>
+        <w:t xml:space="preserve">antimicrobial resistance; infectious disease surveillance; large</w:t>
+      </w:r>
+      <w:r>
+        <w:t xml:space="preserve"> </w:t>
+      </w:r>
+      <w:r>
+        <w:t xml:space="preserve">language models; information extraction; knowledge graph; open data; Asia-Pacific.</w:t>
       </w:r>
     </w:p>
     <w:p>
@@ -487,31 +539,279 @@
         <w:pStyle w:val="FirstParagraph"/>
       </w:pPr>
       <w:r>
-        <w:t xml:space="preserve">[Motivate: AMR burden; open-source epidemic intelligence (WHO EIOS, HealthMap,</w:t>
-      </w:r>
-      <w:r>
-        <w:t xml:space="preserve"> </w:t>
-      </w:r>
-      <w:r>
-        <w:t xml:space="preserve">ProMED, EPIWATCH) targets outbreaks, not structured AMR extraction; LLMs offer</w:t>
-      </w:r>
-      <w:r>
-        <w:t xml:space="preserve"> </w:t>
-      </w:r>
-      <w:r>
-        <w:t xml:space="preserve">new extraction capability but need clinician-grounded, reproducible, benchmarked</w:t>
-      </w:r>
-      <w:r>
-        <w:t xml:space="preserve"> </w:t>
-      </w:r>
-      <w:r>
-        <w:t xml:space="preserve">tooling; gap = an open, AMR-focused, validation-first platform, with an</w:t>
-      </w:r>
-      <w:r>
-        <w:t xml:space="preserve"> </w:t>
-      </w:r>
-      <w:r>
-        <w:t xml:space="preserve">Asia-Pacific lens. — expand with references §8.]</w:t>
+        <w:t xml:space="preserve">Antimicrobial resistance is among the leading global health threats, associated</w:t>
+      </w:r>
+      <w:r>
+        <w:t xml:space="preserve"> </w:t>
+      </w:r>
+      <w:r>
+        <w:t xml:space="preserve">with millions of attributable and associated deaths annually, with the heaviest</w:t>
+      </w:r>
+      <w:r>
+        <w:t xml:space="preserve"> </w:t>
+      </w:r>
+      <w:r>
+        <w:t xml:space="preserve">burden in low- and middle-income regions where surveillance capacity is weakest</w:t>
+      </w:r>
+      <w:r>
+        <w:t xml:space="preserve"> </w:t>
+      </w:r>
+      <w:r>
+        <w:rPr>
+          <w:rStyle w:val="VerbatimChar"/>
+        </w:rPr>
+        <w:t xml:space="preserve">[ref: GBD AMR 2022; WHO AMR]</w:t>
+      </w:r>
+      <w:r>
+        <w:t xml:space="preserve">. Timely awareness of where resistant pathogens and</w:t>
+      </w:r>
+      <w:r>
+        <w:t xml:space="preserve"> </w:t>
+      </w:r>
+      <w:r>
+        <w:t xml:space="preserve">outbreaks are emerging depends on synthesising information that is scattered</w:t>
+      </w:r>
+      <w:r>
+        <w:t xml:space="preserve"> </w:t>
+      </w:r>
+      <w:r>
+        <w:t xml:space="preserve">across many open sources — national and supranational alerts, the biomedical</w:t>
+      </w:r>
+      <w:r>
+        <w:t xml:space="preserve"> </w:t>
+      </w:r>
+      <w:r>
+        <w:t xml:space="preserve">literature and preprints, and clinical-trial registries — updated continuously</w:t>
+      </w:r>
+      <w:r>
+        <w:t xml:space="preserve"> </w:t>
+      </w:r>
+      <w:r>
+        <w:t xml:space="preserve">and in heterogeneous formats.</w:t>
+      </w:r>
+    </w:p>
+    <w:p>
+      <w:pPr>
+        <w:pStyle w:val="BodyText"/>
+      </w:pPr>
+      <w:r>
+        <w:t xml:space="preserve">Open-source epidemic intelligence has a strong tradition: systems such as WHO</w:t>
+      </w:r>
+      <w:r>
+        <w:t xml:space="preserve"> </w:t>
+      </w:r>
+      <w:r>
+        <w:t xml:space="preserve">EIOS, HealthMap, ProMED-mail, and EPIWATCH aggregate and flag disease events from</w:t>
+      </w:r>
+      <w:r>
+        <w:t xml:space="preserve"> </w:t>
+      </w:r>
+      <w:r>
+        <w:t xml:space="preserve">media and official reports</w:t>
+      </w:r>
+      <w:r>
+        <w:t xml:space="preserve"> </w:t>
+      </w:r>
+      <w:r>
+        <w:rPr>
+          <w:rStyle w:val="VerbatimChar"/>
+        </w:rPr>
+        <w:t xml:space="preserve">[ref]</w:t>
+      </w:r>
+      <w:r>
+        <w:t xml:space="preserve">. These systems are valuable for outbreak</w:t>
+      </w:r>
+      <w:r>
+        <w:t xml:space="preserve"> </w:t>
+      </w:r>
+      <w:r>
+        <w:t xml:space="preserve">signal detection, but they are generally oriented toward</w:t>
+      </w:r>
+      <w:r>
+        <w:t xml:space="preserve"> </w:t>
+      </w:r>
+      <w:r>
+        <w:rPr>
+          <w:i/>
+          <w:iCs/>
+        </w:rPr>
+        <w:t xml:space="preserve">events</w:t>
+      </w:r>
+      <w:r>
+        <w:t xml:space="preserve"> </w:t>
+      </w:r>
+      <w:r>
+        <w:t xml:space="preserve">rather than the</w:t>
+      </w:r>
+      <w:r>
+        <w:t xml:space="preserve"> </w:t>
+      </w:r>
+      <w:r>
+        <w:rPr>
+          <w:i/>
+          <w:iCs/>
+        </w:rPr>
+        <w:t xml:space="preserve">structured, AMR-specific entities</w:t>
+      </w:r>
+      <w:r>
+        <w:t xml:space="preserve"> </w:t>
+      </w:r>
+      <w:r>
+        <w:t xml:space="preserve">(pathogen–gene–antibiotic–country</w:t>
+      </w:r>
+      <w:r>
+        <w:t xml:space="preserve"> </w:t>
+      </w:r>
+      <w:r>
+        <w:t xml:space="preserve">relationships) that AMR research and stewardship require, and several are</w:t>
+      </w:r>
+      <w:r>
+        <w:t xml:space="preserve"> </w:t>
+      </w:r>
+      <w:r>
+        <w:t xml:space="preserve">proprietary or not straightforwardly reproducible. Conversely, curated AMR</w:t>
+      </w:r>
+      <w:r>
+        <w:t xml:space="preserve"> </w:t>
+      </w:r>
+      <w:r>
+        <w:t xml:space="preserve">surveillance systems such as WHO GLASS provide high-quality laboratory-based</w:t>
+      </w:r>
+      <w:r>
+        <w:t xml:space="preserve"> </w:t>
+      </w:r>
+      <w:r>
+        <w:t xml:space="preserve">resistance data, but with reporting lag and limited country coverage</w:t>
+      </w:r>
+      <w:r>
+        <w:t xml:space="preserve"> </w:t>
+      </w:r>
+      <w:r>
+        <w:rPr>
+          <w:rStyle w:val="VerbatimChar"/>
+        </w:rPr>
+        <w:t xml:space="preserve">[ref]</w:t>
+      </w:r>
+      <w:r>
+        <w:t xml:space="preserve">.</w:t>
+      </w:r>
+    </w:p>
+    <w:p>
+      <w:pPr>
+        <w:pStyle w:val="BodyText"/>
+      </w:pPr>
+      <w:r>
+        <w:t xml:space="preserve">Large language models (LLMs) now make it feasible to extract structured entities</w:t>
+      </w:r>
+      <w:r>
+        <w:t xml:space="preserve"> </w:t>
+      </w:r>
+      <w:r>
+        <w:t xml:space="preserve">from free text at scale, but their use in AMR surveillance raises questions of</w:t>
+      </w:r>
+      <w:r>
+        <w:t xml:space="preserve"> </w:t>
+      </w:r>
+      <w:r>
+        <w:t xml:space="preserve">accuracy, reproducibility, cost, and clinician trust, and there is little open,</w:t>
+      </w:r>
+      <w:r>
+        <w:t xml:space="preserve"> </w:t>
+      </w:r>
+      <w:r>
+        <w:t xml:space="preserve">benchmarked tooling — particularly outside high-income, English-clinical-note</w:t>
+      </w:r>
+      <w:r>
+        <w:t xml:space="preserve"> </w:t>
+      </w:r>
+      <w:r>
+        <w:t xml:space="preserve">settings</w:t>
+      </w:r>
+      <w:r>
+        <w:t xml:space="preserve"> </w:t>
+      </w:r>
+      <w:r>
+        <w:rPr>
+          <w:rStyle w:val="VerbatimChar"/>
+        </w:rPr>
+        <w:t xml:space="preserve">[ref]</w:t>
+      </w:r>
+      <w:r>
+        <w:t xml:space="preserve">. There is therefore a gap for an</w:t>
+      </w:r>
+      <w:r>
+        <w:t xml:space="preserve"> </w:t>
+      </w:r>
+      <w:r>
+        <w:rPr>
+          <w:b/>
+          <w:bCs/>
+        </w:rPr>
+        <w:t xml:space="preserve">open, reproducible,</w:t>
+      </w:r>
+      <w:r>
+        <w:rPr>
+          <w:b/>
+          <w:bCs/>
+        </w:rPr>
+        <w:t xml:space="preserve"> </w:t>
+      </w:r>
+      <w:r>
+        <w:rPr>
+          <w:b/>
+          <w:bCs/>
+        </w:rPr>
+        <w:t xml:space="preserve">AMR-focused, validation-first</w:t>
+      </w:r>
+      <w:r>
+        <w:t xml:space="preserve"> </w:t>
+      </w:r>
+      <w:r>
+        <w:t xml:space="preserve">platform that (i) ingests open sources</w:t>
+      </w:r>
+      <w:r>
+        <w:t xml:space="preserve"> </w:t>
+      </w:r>
+      <w:r>
+        <w:t xml:space="preserve">automatically, (ii) extracts a structured schema using transparent and LLM</w:t>
+      </w:r>
+      <w:r>
+        <w:t xml:space="preserve"> </w:t>
+      </w:r>
+      <w:r>
+        <w:t xml:space="preserve">methods side by side, (iii) links entities into a knowledge graph, and (iv)</w:t>
+      </w:r>
+      <w:r>
+        <w:t xml:space="preserve"> </w:t>
+      </w:r>
+      <w:r>
+        <w:t xml:space="preserve">grounds its analytics in reference surveillance data — with an explicit</w:t>
+      </w:r>
+      <w:r>
+        <w:t xml:space="preserve"> </w:t>
+      </w:r>
+      <w:r>
+        <w:t xml:space="preserve">Asia-Pacific lens, a region under-represented in existing tools.</w:t>
+      </w:r>
+    </w:p>
+    <w:p>
+      <w:pPr>
+        <w:pStyle w:val="BodyText"/>
+      </w:pPr>
+      <w:r>
+        <w:t xml:space="preserve">We present VIGIL (Vigilance Intelligence for Global Infectious-disease &amp;</w:t>
+      </w:r>
+      <w:r>
+        <w:t xml:space="preserve"> </w:t>
+      </w:r>
+      <w:r>
+        <w:t xml:space="preserve">resistance Landscape), which addresses this gap and is released fully open-source</w:t>
+      </w:r>
+      <w:r>
+        <w:t xml:space="preserve"> </w:t>
+      </w:r>
+      <w:r>
+        <w:t xml:space="preserve">with a citable archive.</w:t>
       </w:r>
     </w:p>
     <w:bookmarkEnd w:id="11"/>
@@ -524,13 +824,13 @@
         <w:t xml:space="preserve">2. Implementation</w:t>
       </w:r>
     </w:p>
-    <w:bookmarkStart w:id="12" w:name="architecture"/>
+    <w:bookmarkStart w:id="12" w:name="overview-and-architecture"/>
     <w:p>
       <w:pPr>
         <w:pStyle w:val="Heading3"/>
       </w:pPr>
       <w:r>
-        <w:t xml:space="preserve">2.1 Architecture</w:t>
+        <w:t xml:space="preserve">2.1 Overview and architecture</w:t>
       </w:r>
     </w:p>
     <w:p>
@@ -538,25 +838,61 @@
         <w:pStyle w:val="FirstParagraph"/>
       </w:pPr>
       <w:r>
-        <w:t xml:space="preserve">Collector → extractor → entities/relations → analytics → web app. Single-file</w:t>
-      </w:r>
-      <w:r>
-        <w:t xml:space="preserve"> </w:t>
-      </w:r>
-      <w:r>
-        <w:t xml:space="preserve">SQLite store; every document retains raw text, source, URL and fetch time; every</w:t>
-      </w:r>
-      <w:r>
-        <w:t xml:space="preserve"> </w:t>
-      </w:r>
-      <w:r>
-        <w:t xml:space="preserve">extraction retains model name/version, prompt version and raw output, enabling</w:t>
-      </w:r>
-      <w:r>
-        <w:t xml:space="preserve"> </w:t>
-      </w:r>
-      <w:r>
-        <w:t xml:space="preserve">audit and model comparison.</w:t>
+        <w:t xml:space="preserve">VIGIL follows a linear, auditable pipeline:</w:t>
+      </w:r>
+      <w:r>
+        <w:t xml:space="preserve"> </w:t>
+      </w:r>
+      <w:r>
+        <w:rPr>
+          <w:b/>
+          <w:bCs/>
+        </w:rPr>
+        <w:t xml:space="preserve">collect → extract →</w:t>
+      </w:r>
+      <w:r>
+        <w:rPr>
+          <w:b/>
+          <w:bCs/>
+        </w:rPr>
+        <w:t xml:space="preserve"> </w:t>
+      </w:r>
+      <w:r>
+        <w:rPr>
+          <w:b/>
+          <w:bCs/>
+        </w:rPr>
+        <w:t xml:space="preserve">entities/relations → analyse → serve</w:t>
+      </w:r>
+      <w:r>
+        <w:t xml:space="preserve"> </w:t>
+      </w:r>
+      <w:r>
+        <w:t xml:space="preserve">(Figure 1). Documents are stored in a</w:t>
+      </w:r>
+      <w:r>
+        <w:t xml:space="preserve"> </w:t>
+      </w:r>
+      <w:r>
+        <w:t xml:space="preserve">single SQLite database. Every document retains its raw text, source, URL, and</w:t>
+      </w:r>
+      <w:r>
+        <w:t xml:space="preserve"> </w:t>
+      </w:r>
+      <w:r>
+        <w:t xml:space="preserve">fetch timestamp; every extraction retains the extractor name, model version,</w:t>
+      </w:r>
+      <w:r>
+        <w:t xml:space="preserve"> </w:t>
+      </w:r>
+      <w:r>
+        <w:t xml:space="preserve">prompt version, and raw output. This provenance makes each analytic result</w:t>
+      </w:r>
+      <w:r>
+        <w:t xml:space="preserve"> </w:t>
+      </w:r>
+      <w:r>
+        <w:t xml:space="preserve">traceable to source text and supports head-to-head comparison of extractors.</w:t>
       </w:r>
     </w:p>
     <w:bookmarkEnd w:id="12"/>
@@ -574,27 +910,376 @@
         <w:pStyle w:val="FirstParagraph"/>
       </w:pPr>
       <w:r>
-        <w:t xml:space="preserve">Eight configured source families (Table 1), accessed through public APIs/feeds:</w:t>
-      </w:r>
-      <w:r>
-        <w:t xml:space="preserve"> </w:t>
-      </w:r>
-      <w:r>
-        <w:t xml:space="preserve">WHO DON (OData), CDC/ECDC/UKHSA (RSS/Atom), PubMed (E-utilities), preprints</w:t>
-      </w:r>
-      <w:r>
-        <w:t xml:space="preserve"> </w:t>
-      </w:r>
-      <w:r>
-        <w:t xml:space="preserve">(Europe PMC), ClinicalTrials.gov (API v2), and WHO GHO/GLASS resistance</w:t>
-      </w:r>
-      <w:r>
-        <w:t xml:space="preserve"> </w:t>
-      </w:r>
-      <w:r>
-        <w:t xml:space="preserve">indicators (OData). Collection de-duplicates and appends only new records.</w:t>
-      </w:r>
-    </w:p>
+        <w:t xml:space="preserve">Eight source families are configured (Table 1), each accessed through public</w:t>
+      </w:r>
+      <w:r>
+        <w:t xml:space="preserve"> </w:t>
+      </w:r>
+      <w:r>
+        <w:t xml:space="preserve">APIs or feeds and de-duplicated so that only new records are appended on each</w:t>
+      </w:r>
+      <w:r>
+        <w:t xml:space="preserve"> </w:t>
+      </w:r>
+      <w:r>
+        <w:t xml:space="preserve">run. Sources span official alerts (WHO DON, CDC, ECDC, UKHSA), the literature</w:t>
+      </w:r>
+      <w:r>
+        <w:t xml:space="preserve"> </w:t>
+      </w:r>
+      <w:r>
+        <w:t xml:space="preserve">(PubMed, bioRxiv/medRxiv via Europe PMC), trials (ClinicalTrials.gov), and</w:t>
+      </w:r>
+      <w:r>
+        <w:t xml:space="preserve"> </w:t>
+      </w:r>
+      <w:r>
+        <w:t xml:space="preserve">reference resistance data (WHO GHO/GLASS).</w:t>
+      </w:r>
+    </w:p>
+    <w:p>
+      <w:pPr>
+        <w:pStyle w:val="BodyText"/>
+      </w:pPr>
+      <w:r>
+        <w:rPr>
+          <w:b/>
+          <w:bCs/>
+        </w:rPr>
+        <w:t xml:space="preserve">Table 1. Configured data sources.</w:t>
+      </w:r>
+    </w:p>
+    <w:tbl>
+      <w:tblPr>
+        <w:tblStyle w:val="Table"/>
+        <w:tblW w:type="pct" w:w="5000"/>
+        <w:tblLayout w:type="fixed"/>
+        <w:tblLook w:firstRow="1" w:lastRow="0" w:firstColumn="0" w:lastColumn="0" w:noHBand="0" w:noVBand="0" w:val="0020"/>
+      </w:tblPr>
+      <w:tblGrid>
+        <w:gridCol w:w="2640"/>
+        <w:gridCol w:w="2640"/>
+        <w:gridCol w:w="2640"/>
+      </w:tblGrid>
+      <w:tr>
+        <w:trPr>
+          <w:tblHeader w:val="on"/>
+        </w:trPr>
+        <w:tc>
+          <w:tcPr/>
+          <w:p>
+            <w:pPr>
+              <w:pStyle w:val="Compact"/>
+            </w:pPr>
+            <w:r>
+              <w:t xml:space="preserve">Source</w:t>
+            </w:r>
+          </w:p>
+        </w:tc>
+        <w:tc>
+          <w:tcPr/>
+          <w:p>
+            <w:pPr>
+              <w:pStyle w:val="Compact"/>
+            </w:pPr>
+            <w:r>
+              <w:t xml:space="preserve">Type</w:t>
+            </w:r>
+          </w:p>
+        </w:tc>
+        <w:tc>
+          <w:tcPr/>
+          <w:p>
+            <w:pPr>
+              <w:pStyle w:val="Compact"/>
+            </w:pPr>
+            <w:r>
+              <w:t xml:space="preserve">Access</w:t>
+            </w:r>
+          </w:p>
+        </w:tc>
+      </w:tr>
+      <w:tr>
+        <w:tc>
+          <w:tcPr/>
+          <w:p>
+            <w:pPr>
+              <w:pStyle w:val="Compact"/>
+            </w:pPr>
+            <w:r>
+              <w:t xml:space="preserve">WHO Disease Outbreak News</w:t>
+            </w:r>
+          </w:p>
+        </w:tc>
+        <w:tc>
+          <w:tcPr/>
+          <w:p>
+            <w:pPr>
+              <w:pStyle w:val="Compact"/>
+            </w:pPr>
+            <w:r>
+              <w:t xml:space="preserve">Official outbreak alerts</w:t>
+            </w:r>
+          </w:p>
+        </w:tc>
+        <w:tc>
+          <w:tcPr/>
+          <w:p>
+            <w:pPr>
+              <w:pStyle w:val="Compact"/>
+            </w:pPr>
+            <w:r>
+              <w:t xml:space="preserve">JSON (OData) API</w:t>
+            </w:r>
+          </w:p>
+        </w:tc>
+      </w:tr>
+      <w:tr>
+        <w:tc>
+          <w:tcPr/>
+          <w:p>
+            <w:pPr>
+              <w:pStyle w:val="Compact"/>
+            </w:pPr>
+            <w:r>
+              <w:t xml:space="preserve">US CDC</w:t>
+            </w:r>
+          </w:p>
+        </w:tc>
+        <w:tc>
+          <w:tcPr/>
+          <w:p>
+            <w:pPr>
+              <w:pStyle w:val="Compact"/>
+            </w:pPr>
+            <w:r>
+              <w:t xml:space="preserve">Alerts / MMWR / newsroom</w:t>
+            </w:r>
+          </w:p>
+        </w:tc>
+        <w:tc>
+          <w:tcPr/>
+          <w:p>
+            <w:pPr>
+              <w:pStyle w:val="Compact"/>
+            </w:pPr>
+            <w:r>
+              <w:t xml:space="preserve">RSS</w:t>
+            </w:r>
+          </w:p>
+        </w:tc>
+      </w:tr>
+      <w:tr>
+        <w:tc>
+          <w:tcPr/>
+          <w:p>
+            <w:pPr>
+              <w:pStyle w:val="Compact"/>
+            </w:pPr>
+            <w:r>
+              <w:t xml:space="preserve">ECDC</w:t>
+            </w:r>
+          </w:p>
+        </w:tc>
+        <w:tc>
+          <w:tcPr/>
+          <w:p>
+            <w:pPr>
+              <w:pStyle w:val="Compact"/>
+            </w:pPr>
+            <w:r>
+              <w:t xml:space="preserve">European communicable-disease news</w:t>
+            </w:r>
+          </w:p>
+        </w:tc>
+        <w:tc>
+          <w:tcPr/>
+          <w:p>
+            <w:pPr>
+              <w:pStyle w:val="Compact"/>
+            </w:pPr>
+            <w:r>
+              <w:t xml:space="preserve">RSS</w:t>
+            </w:r>
+          </w:p>
+        </w:tc>
+      </w:tr>
+      <w:tr>
+        <w:tc>
+          <w:tcPr/>
+          <w:p>
+            <w:pPr>
+              <w:pStyle w:val="Compact"/>
+            </w:pPr>
+            <w:r>
+              <w:t xml:space="preserve">UK Health Security Agency</w:t>
+            </w:r>
+          </w:p>
+        </w:tc>
+        <w:tc>
+          <w:tcPr/>
+          <w:p>
+            <w:pPr>
+              <w:pStyle w:val="Compact"/>
+            </w:pPr>
+            <w:r>
+              <w:t xml:space="preserve">News &amp; guidance</w:t>
+            </w:r>
+          </w:p>
+        </w:tc>
+        <w:tc>
+          <w:tcPr/>
+          <w:p>
+            <w:pPr>
+              <w:pStyle w:val="Compact"/>
+            </w:pPr>
+            <w:r>
+              <w:t xml:space="preserve">GOV.UK Atom feed</w:t>
+            </w:r>
+          </w:p>
+        </w:tc>
+      </w:tr>
+      <w:tr>
+        <w:tc>
+          <w:tcPr/>
+          <w:p>
+            <w:pPr>
+              <w:pStyle w:val="Compact"/>
+            </w:pPr>
+            <w:r>
+              <w:t xml:space="preserve">PubMed</w:t>
+            </w:r>
+          </w:p>
+        </w:tc>
+        <w:tc>
+          <w:tcPr/>
+          <w:p>
+            <w:pPr>
+              <w:pStyle w:val="Compact"/>
+            </w:pPr>
+            <w:r>
+              <w:t xml:space="preserve">Peer-reviewed literature</w:t>
+            </w:r>
+          </w:p>
+        </w:tc>
+        <w:tc>
+          <w:tcPr/>
+          <w:p>
+            <w:pPr>
+              <w:pStyle w:val="Compact"/>
+            </w:pPr>
+            <w:r>
+              <w:t xml:space="preserve">NCBI E-utilities</w:t>
+            </w:r>
+          </w:p>
+        </w:tc>
+      </w:tr>
+      <w:tr>
+        <w:tc>
+          <w:tcPr/>
+          <w:p>
+            <w:pPr>
+              <w:pStyle w:val="Compact"/>
+            </w:pPr>
+            <w:r>
+              <w:t xml:space="preserve">bioRxiv / medRxiv</w:t>
+            </w:r>
+          </w:p>
+        </w:tc>
+        <w:tc>
+          <w:tcPr/>
+          <w:p>
+            <w:pPr>
+              <w:pStyle w:val="Compact"/>
+            </w:pPr>
+            <w:r>
+              <w:t xml:space="preserve">Preprints</w:t>
+            </w:r>
+          </w:p>
+        </w:tc>
+        <w:tc>
+          <w:tcPr/>
+          <w:p>
+            <w:pPr>
+              <w:pStyle w:val="Compact"/>
+            </w:pPr>
+            <w:r>
+              <w:t xml:space="preserve">Europe PMC REST API</w:t>
+            </w:r>
+          </w:p>
+        </w:tc>
+      </w:tr>
+      <w:tr>
+        <w:tc>
+          <w:tcPr/>
+          <w:p>
+            <w:pPr>
+              <w:pStyle w:val="Compact"/>
+            </w:pPr>
+            <w:r>
+              <w:t xml:space="preserve">ClinicalTrials.gov</w:t>
+            </w:r>
+          </w:p>
+        </w:tc>
+        <w:tc>
+          <w:tcPr/>
+          <w:p>
+            <w:pPr>
+              <w:pStyle w:val="Compact"/>
+            </w:pPr>
+            <w:r>
+              <w:t xml:space="preserve">Trial registrations</w:t>
+            </w:r>
+          </w:p>
+        </w:tc>
+        <w:tc>
+          <w:tcPr/>
+          <w:p>
+            <w:pPr>
+              <w:pStyle w:val="Compact"/>
+            </w:pPr>
+            <w:r>
+              <w:t xml:space="preserve">API v2</w:t>
+            </w:r>
+          </w:p>
+        </w:tc>
+      </w:tr>
+      <w:tr>
+        <w:tc>
+          <w:tcPr/>
+          <w:p>
+            <w:pPr>
+              <w:pStyle w:val="Compact"/>
+            </w:pPr>
+            <w:r>
+              <w:t xml:space="preserve">WHO GHO / GLASS</w:t>
+            </w:r>
+          </w:p>
+        </w:tc>
+        <w:tc>
+          <w:tcPr/>
+          <w:p>
+            <w:pPr>
+              <w:pStyle w:val="Compact"/>
+            </w:pPr>
+            <w:r>
+              <w:t xml:space="preserve">Reference resistance indicators</w:t>
+            </w:r>
+          </w:p>
+        </w:tc>
+        <w:tc>
+          <w:tcPr/>
+          <w:p>
+            <w:pPr>
+              <w:pStyle w:val="Compact"/>
+            </w:pPr>
+            <w:r>
+              <w:t xml:space="preserve">GHO OData API</w:t>
+            </w:r>
+          </w:p>
+        </w:tc>
+      </w:tr>
+    </w:tbl>
     <w:bookmarkEnd w:id="13"/>
     <w:bookmarkStart w:id="14" w:name="information-extraction"/>
     <w:p>
@@ -610,7 +1295,7 @@
         <w:pStyle w:val="FirstParagraph"/>
       </w:pPr>
       <w:r>
-        <w:t xml:space="preserve">An always-on</w:t>
+        <w:t xml:space="preserve">Two extractors return an identical schema. The</w:t>
       </w:r>
       <w:r>
         <w:t xml:space="preserve"> </w:t>
@@ -626,13 +1311,25 @@
         <w:t xml:space="preserve"> </w:t>
       </w:r>
       <w:r>
-        <w:t xml:space="preserve">extractor uses frozen controlled vocabularies (the</w:t>
-      </w:r>
-      <w:r>
-        <w:t xml:space="preserve"> </w:t>
-      </w:r>
-      <w:r>
-        <w:t xml:space="preserve">codebook) and negation/assertion rules; an optional</w:t>
+        <w:t xml:space="preserve">extractor applies</w:t>
+      </w:r>
+      <w:r>
+        <w:t xml:space="preserve"> </w:t>
+      </w:r>
+      <w:r>
+        <w:t xml:space="preserve">frozen controlled vocabularies (a versioned codebook) with word-boundary</w:t>
+      </w:r>
+      <w:r>
+        <w:t xml:space="preserve"> </w:t>
+      </w:r>
+      <w:r>
+        <w:t xml:space="preserve">matching, country-alias canonicalisation, and assertion/negation handling; it is</w:t>
+      </w:r>
+      <w:r>
+        <w:t xml:space="preserve"> </w:t>
+      </w:r>
+      <w:r>
+        <w:t xml:space="preserve">free, offline, deterministic, and serves as the benchmark baseline. The optional</w:t>
       </w:r>
       <w:r>
         <w:t xml:space="preserve"> </w:t>
@@ -648,19 +1345,37 @@
         <w:t xml:space="preserve"> </w:t>
       </w:r>
       <w:r>
-        <w:t xml:space="preserve">extractor (Gemini;</w:t>
-      </w:r>
-      <w:r>
-        <w:t xml:space="preserve"> </w:t>
-      </w:r>
-      <w:r>
-        <w:t xml:space="preserve">extensible) returns the same schema. Both outputs are stored per document,</w:t>
-      </w:r>
-      <w:r>
-        <w:t xml:space="preserve"> </w:t>
-      </w:r>
-      <w:r>
-        <w:t xml:space="preserve">enabling head-to-head evaluation.</w:t>
+        <w:t xml:space="preserve">extractor (Google Gemini in the current build; the interface is</w:t>
+      </w:r>
+      <w:r>
+        <w:t xml:space="preserve"> </w:t>
+      </w:r>
+      <w:r>
+        <w:t xml:space="preserve">model-agnostic) is prompted to return the same JSON schema. Because both outputs</w:t>
+      </w:r>
+      <w:r>
+        <w:t xml:space="preserve"> </w:t>
+      </w:r>
+      <w:r>
+        <w:t xml:space="preserve">are stored per document, VIGIL supports a direct, reproducible comparison of</w:t>
+      </w:r>
+      <w:r>
+        <w:t xml:space="preserve"> </w:t>
+      </w:r>
+      <w:r>
+        <w:t xml:space="preserve">methods — for example, on a paper describing altered ceftazidime-avibactam</w:t>
+      </w:r>
+      <w:r>
+        <w:t xml:space="preserve"> </w:t>
+      </w:r>
+      <w:r>
+        <w:t xml:space="preserve">resistance, the LLM recovered specific alleles (KPC-234, NDM-1) and plasmid</w:t>
+      </w:r>
+      <w:r>
+        <w:t xml:space="preserve"> </w:t>
+      </w:r>
+      <w:r>
+        <w:t xml:space="preserve">context that the dictionary baseline did not.</w:t>
       </w:r>
     </w:p>
     <w:bookmarkEnd w:id="14"/>
@@ -678,37 +1393,61 @@
         <w:pStyle w:val="FirstParagraph"/>
       </w:pPr>
       <w:r>
-        <w:t xml:space="preserve">Entity co-occurrence within documents yields Pathogen→Country→Gene→Antibiotic→</w:t>
-      </w:r>
-      <w:r>
-        <w:t xml:space="preserve"> </w:t>
-      </w:r>
-      <w:r>
-        <w:t xml:space="preserve">Disease relations. Analytics include: growth-rate and emerging-signal detection;</w:t>
-      </w:r>
-      <w:r>
-        <w:t xml:space="preserve"> </w:t>
-      </w:r>
-      <w:r>
-        <w:t xml:space="preserve">weekly-volume forecasting with backtesting; novelty detection (first-ever entity</w:t>
-      </w:r>
-      <w:r>
-        <w:t xml:space="preserve"> </w:t>
-      </w:r>
-      <w:r>
-        <w:t xml:space="preserve">combinations); a knowledge-graph query interface; a global heatmap; a</w:t>
-      </w:r>
-      <w:r>
-        <w:t xml:space="preserve"> </w:t>
-      </w:r>
-      <w:r>
-        <w:t xml:space="preserve">validation-first country risk signal; and an outbreak module with</w:t>
-      </w:r>
-      <w:r>
-        <w:t xml:space="preserve"> </w:t>
-      </w:r>
-      <w:r>
-        <w:t xml:space="preserve">source-separated evaluation.</w:t>
+        <w:t xml:space="preserve">Entity co-occurrence within a document generates</w:t>
+      </w:r>
+      <w:r>
+        <w:t xml:space="preserve"> </w:t>
+      </w:r>
+      <w:r>
+        <w:t xml:space="preserve">Pathogen→Country→Gene→Antibiotic→Disease relations, queryable as a graph. On top</w:t>
+      </w:r>
+      <w:r>
+        <w:t xml:space="preserve"> </w:t>
+      </w:r>
+      <w:r>
+        <w:t xml:space="preserve">of the graph and entity tables, VIGIL provides: (1) trend analysis with</w:t>
+      </w:r>
+      <w:r>
+        <w:t xml:space="preserve"> </w:t>
+      </w:r>
+      <w:r>
+        <w:t xml:space="preserve">growth-rate and emerging-signal detection; (2) weekly discussion-volume</w:t>
+      </w:r>
+      <w:r>
+        <w:t xml:space="preserve"> </w:t>
+      </w:r>
+      <w:r>
+        <w:t xml:space="preserve">forecasting with a transparent baseline and rolling backtest; (3) novelty</w:t>
+      </w:r>
+      <w:r>
+        <w:t xml:space="preserve"> </w:t>
+      </w:r>
+      <w:r>
+        <w:t xml:space="preserve">detection that flags entity combinations never previously co-occurring in the</w:t>
+      </w:r>
+      <w:r>
+        <w:t xml:space="preserve"> </w:t>
+      </w:r>
+      <w:r>
+        <w:t xml:space="preserve">corpus; (4) a knowledge-graph query interface (e.g. </w:t>
+      </w:r>
+      <w:r>
+        <w:t xml:space="preserve">“which countries have newly</w:t>
+      </w:r>
+      <w:r>
+        <w:t xml:space="preserve"> </w:t>
+      </w:r>
+      <w:r>
+        <w:t xml:space="preserve">reported a given resistance mechanism?”</w:t>
+      </w:r>
+      <w:r>
+        <w:t xml:space="preserve">); (5) a global choropleth; (6) a</w:t>
+      </w:r>
+      <w:r>
+        <w:t xml:space="preserve"> </w:t>
+      </w:r>
+      <w:r>
+        <w:t xml:space="preserve">validation-first country risk signal; and (7) an outbreak module.</w:t>
       </w:r>
     </w:p>
     <w:bookmarkEnd w:id="15"/>
@@ -726,41 +1465,90 @@
         <w:pStyle w:val="FirstParagraph"/>
       </w:pPr>
       <w:r>
-        <w:t xml:space="preserve">Reference standard = WHO GHO/GLASS resistance indicators (auto-ingested).</w:t>
-      </w:r>
-      <w:r>
-        <w:t xml:space="preserve"> </w:t>
-      </w:r>
-      <w:r>
-        <w:t xml:space="preserve">Construct validity compares platform signals to measured resistance; the outbreak</w:t>
-      </w:r>
-      <w:r>
-        <w:t xml:space="preserve"> </w:t>
-      </w:r>
-      <w:r>
-        <w:t xml:space="preserve">task uses official-alert outcomes with literature-derived features (source</w:t>
-      </w:r>
-      <w:r>
-        <w:t xml:space="preserve"> </w:t>
-      </w:r>
-      <w:r>
-        <w:t xml:space="preserve">separation) to avoid circularity. A frozen annotation codebook supports a</w:t>
-      </w:r>
-      <w:r>
-        <w:t xml:space="preserve"> </w:t>
-      </w:r>
-      <w:r>
-        <w:t xml:space="preserve">downstream clinician-annotated extraction benchmark (leakage-controlled).</w:t>
+        <w:t xml:space="preserve">Analytics are grounded in reference data rather than asserted. WHO GHO/GLASS</w:t>
+      </w:r>
+      <w:r>
+        <w:t xml:space="preserve"> </w:t>
+      </w:r>
+      <w:r>
+        <w:t xml:space="preserve">resistance indicators (proportion of MRSA and third-generation-cephalosporin-</w:t>
+      </w:r>
+      <w:r>
+        <w:t xml:space="preserve"> </w:t>
+      </w:r>
+      <w:r>
+        <w:t xml:space="preserve">resistant</w:t>
+      </w:r>
+      <w:r>
+        <w:t xml:space="preserve"> </w:t>
+      </w:r>
+      <w:r>
+        <w:rPr>
+          <w:i/>
+          <w:iCs/>
+        </w:rPr>
+        <w:t xml:space="preserve">E. coli</w:t>
+      </w:r>
+      <w:r>
+        <w:t xml:space="preserve"> </w:t>
+      </w:r>
+      <w:r>
+        <w:t xml:space="preserve">bloodstream infections) are ingested automatically as ground</w:t>
+      </w:r>
+      <w:r>
+        <w:t xml:space="preserve"> </w:t>
+      </w:r>
+      <w:r>
+        <w:t xml:space="preserve">truth. Construct validity is assessed cross-sectionally against these values. The</w:t>
+      </w:r>
+      <w:r>
+        <w:t xml:space="preserve"> </w:t>
+      </w:r>
+      <w:r>
+        <w:t xml:space="preserve">outbreak task deliberately separates sources — outcomes are taken from official</w:t>
+      </w:r>
+      <w:r>
+        <w:t xml:space="preserve"> </w:t>
+      </w:r>
+      <w:r>
+        <w:t xml:space="preserve">alerts (WHO/CDC/ECDC/UKHSA) while features derive from the literature stream — to</w:t>
+      </w:r>
+      <w:r>
+        <w:t xml:space="preserve"> </w:t>
+      </w:r>
+      <w:r>
+        <w:t xml:space="preserve">avoid circularity. A frozen annotation codebook and a</w:t>
+      </w:r>
+      <w:r>
+        <w:t xml:space="preserve"> </w:t>
+      </w:r>
+      <w:r>
+        <w:rPr>
+          <w:rStyle w:val="VerbatimChar"/>
+        </w:rPr>
+        <w:t xml:space="preserve">annotations</w:t>
+      </w:r>
+      <w:r>
+        <w:t xml:space="preserve"> </w:t>
+      </w:r>
+      <w:r>
+        <w:t xml:space="preserve">table support</w:t>
+      </w:r>
+      <w:r>
+        <w:t xml:space="preserve"> </w:t>
+      </w:r>
+      <w:r>
+        <w:t xml:space="preserve">a planned clinician-annotated extraction benchmark under leakage controls.</w:t>
       </w:r>
     </w:p>
     <w:bookmarkEnd w:id="16"/>
-    <w:bookmarkStart w:id="17" w:name="availability-reproducibility"/>
+    <w:bookmarkStart w:id="17" w:name="availability-and-reproducibility"/>
     <w:p>
       <w:pPr>
         <w:pStyle w:val="Heading3"/>
       </w:pPr>
       <w:r>
-        <w:t xml:space="preserve">2.6 Availability &amp; reproducibility</w:t>
+        <w:t xml:space="preserve">2.6 Availability and reproducibility</w:t>
       </w:r>
     </w:p>
     <w:p>
@@ -768,24 +1556,39 @@
         <w:pStyle w:val="FirstParagraph"/>
       </w:pPr>
       <w:r>
-        <w:t xml:space="preserve">Open source (MIT), archived on Zenodo (DOI), free daily updates via CI, and a</w:t>
-      </w:r>
-      <w:r>
-        <w:t xml:space="preserve"> </w:t>
-      </w:r>
-      <w:r>
-        <w:t xml:space="preserve">public live instance. All code, the codebook, and the schema are versioned.</w:t>
+        <w:t xml:space="preserve">VIGIL is open-source (MIT), archived on Zenodo with a DOI, deployed as a public</w:t>
+      </w:r>
+      <w:r>
+        <w:t xml:space="preserve"> </w:t>
+      </w:r>
+      <w:r>
+        <w:t xml:space="preserve">live instance, and updated daily at no cost via continuous integration. Code, the</w:t>
+      </w:r>
+      <w:r>
+        <w:t xml:space="preserve"> </w:t>
+      </w:r>
+      <w:r>
+        <w:t xml:space="preserve">codebook, and the schema are versioned; a single command reproduces the pipeline.</w:t>
       </w:r>
     </w:p>
     <w:bookmarkEnd w:id="17"/>
     <w:bookmarkEnd w:id="18"/>
-    <w:bookmarkStart w:id="19" w:name="results-proof-of-concept"/>
+    <w:bookmarkStart w:id="22" w:name="results"/>
     <w:p>
       <w:pPr>
         <w:pStyle w:val="Heading2"/>
       </w:pPr>
       <w:r>
-        <w:t xml:space="preserve">3. Results (proof of concept)</w:t>
+        <w:t xml:space="preserve">3. Results</w:t>
+      </w:r>
+    </w:p>
+    <w:bookmarkStart w:id="19" w:name="corpus"/>
+    <w:p>
+      <w:pPr>
+        <w:pStyle w:val="Heading3"/>
+      </w:pPr>
+      <w:r>
+        <w:t xml:space="preserve">3.1 Corpus</w:t>
       </w:r>
     </w:p>
     <w:p>
@@ -793,29 +1596,193 @@
         <w:pStyle w:val="FirstParagraph"/>
       </w:pPr>
       <w:r>
-        <w:t xml:space="preserve">[Insert: corpus description (Table/Fig), extraction examples (e.g. detection of</w:t>
-      </w:r>
-      <w:r>
-        <w:t xml:space="preserve"> </w:t>
-      </w:r>
-      <w:r>
-        <w:t xml:space="preserve">KPC-234/NDM-1 that a dictionary misses), knowledge-graph example (CRE →</w:t>
-      </w:r>
-      <w:r>
-        <w:t xml:space="preserve"> </w:t>
-      </w:r>
-      <w:r>
-        <w:t xml:space="preserve">country → gene → antibiotic), and the preliminary validity numbers above.</w:t>
-      </w:r>
-      <w:r>
-        <w:t xml:space="preserve"> </w:t>
-      </w:r>
-      <w:r>
-        <w:t xml:space="preserve">Regenerate all numbers from the live platform before submission.]</w:t>
+        <w:t xml:space="preserve">The analysed snapshot contained 2,075 documents. Seven sources contributed</w:t>
+      </w:r>
+      <w:r>
+        <w:t xml:space="preserve"> </w:t>
+      </w:r>
+      <w:r>
+        <w:t xml:space="preserve">actively (CDC n=1,828; preprints n=116; PubMed n=54; ClinicalTrials n=37; UKHSA</w:t>
+      </w:r>
+      <w:r>
+        <w:t xml:space="preserve"> </w:t>
+      </w:r>
+      <w:r>
+        <w:t xml:space="preserve">n=20; ECDC n=10; WHO DON n=10); the GLASS ingestion path is included but was not</w:t>
+      </w:r>
+      <w:r>
+        <w:t xml:space="preserve"> </w:t>
+      </w:r>
+      <w:r>
+        <w:t xml:space="preserve">populated in this snapshot. Extraction yielded 31 distinct pathogens (including</w:t>
+      </w:r>
+      <w:r>
+        <w:t xml:space="preserve"> </w:t>
+      </w:r>
+      <w:r>
+        <w:t xml:space="preserve">the priority phenotypes MRSA, VRE, CRE, CRAB, and</w:t>
+      </w:r>
+      <w:r>
+        <w:t xml:space="preserve"> </w:t>
+      </w:r>
+      <w:r>
+        <w:rPr>
+          <w:i/>
+          <w:iCs/>
+        </w:rPr>
+        <w:t xml:space="preserve">Candida auris</w:t>
+      </w:r>
+      <w:r>
+        <w:t xml:space="preserve">), 12 resistance</w:t>
+      </w:r>
+      <w:r>
+        <w:t xml:space="preserve"> </w:t>
+      </w:r>
+      <w:r>
+        <w:t xml:space="preserve">genes/mechanisms, 62 countries, and 1,060 knowledge-graph relations. The WHO GHO</w:t>
+      </w:r>
+      <w:r>
+        <w:t xml:space="preserve"> </w:t>
+      </w:r>
+      <w:r>
+        <w:t xml:space="preserve">ingestion added 1,005 reference resistance values spanning 101 countries and</w:t>
+      </w:r>
+      <w:r>
+        <w:t xml:space="preserve"> </w:t>
+      </w:r>
+      <w:r>
+        <w:t xml:space="preserve">2016–2023.</w:t>
       </w:r>
     </w:p>
     <w:bookmarkEnd w:id="19"/>
-    <w:bookmarkStart w:id="20" w:name="discussion"/>
+    <w:bookmarkStart w:id="20" w:name="Xfe362eb0d94a590b7c669f8e7a55a7ca804140e"/>
+    <w:p>
+      <w:pPr>
+        <w:pStyle w:val="Heading3"/>
+      </w:pPr>
+      <w:r>
+        <w:t xml:space="preserve">3.2 Extraction and knowledge graph (illustrative)</w:t>
+      </w:r>
+    </w:p>
+    <w:p>
+      <w:pPr>
+        <w:pStyle w:val="FirstParagraph"/>
+      </w:pPr>
+      <w:r>
+        <w:t xml:space="preserve">Structured extraction reproduced expected AMR concepts and, for the LLM</w:t>
+      </w:r>
+      <w:r>
+        <w:t xml:space="preserve"> </w:t>
+      </w:r>
+      <w:r>
+        <w:t xml:space="preserve">extractor, recovered fine-grained resistance alleles absent from the baseline</w:t>
+      </w:r>
+      <w:r>
+        <w:t xml:space="preserve"> </w:t>
+      </w:r>
+      <w:r>
+        <w:t xml:space="preserve">dictionary. Graph queries returned interpretable chains — for example, for</w:t>
+      </w:r>
+      <w:r>
+        <w:t xml:space="preserve"> </w:t>
+      </w:r>
+      <w:r>
+        <w:t xml:space="preserve">carbapenem-resistant Enterobacterales the platform linked specific countries,</w:t>
+      </w:r>
+      <w:r>
+        <w:t xml:space="preserve"> </w:t>
+      </w:r>
+      <w:r>
+        <w:t xml:space="preserve">carbapenemase genes (e.g. OXA-48, KPC, NDM), and agents (e.g.</w:t>
+      </w:r>
+      <w:r>
+        <w:t xml:space="preserve"> </w:t>
+      </w:r>
+      <w:r>
+        <w:t xml:space="preserve">ceftazidime-avibactam), each traceable to the underlying documents.</w:t>
+      </w:r>
+    </w:p>
+    <w:bookmarkEnd w:id="20"/>
+    <w:bookmarkStart w:id="21" w:name="preliminary-validation"/>
+    <w:p>
+      <w:pPr>
+        <w:pStyle w:val="Heading3"/>
+      </w:pPr>
+      <w:r>
+        <w:t xml:space="preserve">3.3 Preliminary validation</w:t>
+      </w:r>
+    </w:p>
+    <w:p>
+      <w:pPr>
+        <w:pStyle w:val="FirstParagraph"/>
+      </w:pPr>
+      <w:r>
+        <w:t xml:space="preserve">Across the 23 countries with both a platform AMR signal and a WHO GHO MRSA value,</w:t>
+      </w:r>
+      <w:r>
+        <w:t xml:space="preserve"> </w:t>
+      </w:r>
+      <w:r>
+        <w:t xml:space="preserve">raw document volume was essentially uncorrelated with measured resistance</w:t>
+      </w:r>
+      <w:r>
+        <w:t xml:space="preserve"> </w:t>
+      </w:r>
+      <w:r>
+        <w:t xml:space="preserve">(Spearman ρ = 0.06), whereas a publication-normalised AMR share showed a weak</w:t>
+      </w:r>
+      <w:r>
+        <w:t xml:space="preserve"> </w:t>
+      </w:r>
+      <w:r>
+        <w:t xml:space="preserve">positive association (ρ = 0.28) — consistent with document volume reflecting</w:t>
+      </w:r>
+      <w:r>
+        <w:t xml:space="preserve"> </w:t>
+      </w:r>
+      <w:r>
+        <w:t xml:space="preserve">research output rather than disease burden, and with normalisation partially</w:t>
+      </w:r>
+      <w:r>
+        <w:t xml:space="preserve"> </w:t>
+      </w:r>
+      <w:r>
+        <w:t xml:space="preserve">recovering signal. In the outbreak task (39 countries, 29 with an officially</w:t>
+      </w:r>
+      <w:r>
+        <w:t xml:space="preserve"> </w:t>
+      </w:r>
+      <w:r>
+        <w:t xml:space="preserve">reported outbreak), literature signal did not discriminate outbreak-affected</w:t>
+      </w:r>
+      <w:r>
+        <w:t xml:space="preserve"> </w:t>
+      </w:r>
+      <w:r>
+        <w:t xml:space="preserve">countries (rank-AUC = 0.16); reported outbreaks concentrated in low-literature,</w:t>
+      </w:r>
+      <w:r>
+        <w:t xml:space="preserve"> </w:t>
+      </w:r>
+      <w:r>
+        <w:t xml:space="preserve">lower-resource settings. These proof-of-concept results are preliminary and are</w:t>
+      </w:r>
+      <w:r>
+        <w:t xml:space="preserve"> </w:t>
+      </w:r>
+      <w:r>
+        <w:t xml:space="preserve">expected to sharpen as the corpus accumulates, but they already demonstrate the</w:t>
+      </w:r>
+      <w:r>
+        <w:t xml:space="preserve"> </w:t>
+      </w:r>
+      <w:r>
+        <w:t xml:space="preserve">platform’s ability to make the surveillance gap explicit and measurable.</w:t>
+      </w:r>
+    </w:p>
+    <w:bookmarkEnd w:id="21"/>
+    <w:bookmarkEnd w:id="22"/>
+    <w:bookmarkStart w:id="23" w:name="discussion"/>
     <w:p>
       <w:pPr>
         <w:pStyle w:val="Heading2"/>
@@ -829,144 +1796,35 @@
         <w:pStyle w:val="FirstParagraph"/>
       </w:pPr>
       <w:r>
-        <w:t xml:space="preserve">Positioning vs event-based systems; the measurable surveillance gap as an early</w:t>
-      </w:r>
-      <w:r>
-        <w:t xml:space="preserve"> </w:t>
-      </w:r>
-      <w:r>
-        <w:t xml:space="preserve">finding; enablement of reproducible LLM-extraction benchmarking and early-warning</w:t>
-      </w:r>
-      <w:r>
-        <w:t xml:space="preserve"> </w:t>
-      </w:r>
-      <w:r>
-        <w:t xml:space="preserve">research; APAC relevance.</w:t>
-      </w:r>
-    </w:p>
-    <w:bookmarkEnd w:id="20"/>
-    <w:bookmarkStart w:id="21" w:name="limitations"/>
-    <w:p>
-      <w:pPr>
-        <w:pStyle w:val="Heading2"/>
-      </w:pPr>
-      <w:r>
-        <w:t xml:space="preserve">5. Limitations</w:t>
-      </w:r>
-    </w:p>
-    <w:p>
-      <w:pPr>
-        <w:pStyle w:val="FirstParagraph"/>
-      </w:pPr>
-      <w:r>
-        <w:t xml:space="preserve">Young corpus (analytics strengthen as history accumulates); reporting/publication</w:t>
-      </w:r>
-      <w:r>
-        <w:t xml:space="preserve"> </w:t>
-      </w:r>
-      <w:r>
-        <w:t xml:space="preserve">bias (explicitly surfaced, not hidden); reference coverage — WHO GHO lacks some</w:t>
-      </w:r>
-      <w:r>
-        <w:t xml:space="preserve"> </w:t>
-      </w:r>
-      <w:r>
-        <w:t xml:space="preserve">territories including Taiwan (a WHO listing limitation, not a platform merge),</w:t>
-      </w:r>
-      <w:r>
-        <w:t xml:space="preserve"> </w:t>
-      </w:r>
-      <w:r>
-        <w:t xml:space="preserve">and China lacks values for these indicators; LLM free-tier throughput; the</w:t>
-      </w:r>
-      <w:r>
-        <w:t xml:space="preserve"> </w:t>
-      </w:r>
-      <w:r>
-        <w:t xml:space="preserve">extraction benchmark awaits full clinician annotation.</w:t>
-      </w:r>
-    </w:p>
-    <w:bookmarkEnd w:id="21"/>
-    <w:bookmarkStart w:id="22" w:name="conclusion"/>
-    <w:p>
-      <w:pPr>
-        <w:pStyle w:val="Heading2"/>
-      </w:pPr>
-      <w:r>
-        <w:t xml:space="preserve">6. Conclusion</w:t>
-      </w:r>
-    </w:p>
-    <w:p>
-      <w:pPr>
-        <w:pStyle w:val="FirstParagraph"/>
-      </w:pPr>
-      <w:r>
-        <w:t xml:space="preserve">An open, validation-first platform turning open-source text into structured,</w:t>
-      </w:r>
-      <w:r>
-        <w:t xml:space="preserve"> </w:t>
-      </w:r>
-      <w:r>
-        <w:t xml:space="preserve">citable AMR/infectious-disease intelligence, and a base for a program of</w:t>
-      </w:r>
-      <w:r>
-        <w:t xml:space="preserve"> </w:t>
-      </w:r>
-      <w:r>
-        <w:t xml:space="preserve">methodological studies.</w:t>
-      </w:r>
-    </w:p>
-    <w:bookmarkEnd w:id="22"/>
-    <w:bookmarkStart w:id="23" w:name="declarations"/>
-    <w:p>
-      <w:pPr>
-        <w:pStyle w:val="Heading2"/>
-      </w:pPr>
-      <w:r>
-        <w:t xml:space="preserve">7. Declarations</w:t>
-      </w:r>
-    </w:p>
-    <w:p>
-      <w:pPr>
-        <w:pStyle w:val="FirstParagraph"/>
-      </w:pPr>
+        <w:t xml:space="preserve">VIGIL complements, rather than duplicates, existing open-source</w:t>
+      </w:r>
+      <w:r>
+        <w:t xml:space="preserve"> </w:t>
+      </w:r>
+      <w:r>
+        <w:t xml:space="preserve">epidemic-intelligence systems: where those emphasise outbreak-event detection,</w:t>
+      </w:r>
+      <w:r>
+        <w:t xml:space="preserve"> </w:t>
+      </w:r>
+      <w:r>
+        <w:t xml:space="preserve">VIGIL emphasises</w:t>
+      </w:r>
+      <w:r>
+        <w:t xml:space="preserve"> </w:t>
+      </w:r>
       <w:r>
         <w:rPr>
           <w:b/>
           <w:bCs/>
         </w:rPr>
-        <w:t xml:space="preserve">Data/code availability:</w:t>
-      </w:r>
-      <w:r>
-        <w:t xml:space="preserve"> </w:t>
-      </w:r>
-      <w:r>
-        <w:t xml:space="preserve">as above (GitHub + Zenodo DOI).</w:t>
-      </w:r>
-      <w:r>
-        <w:t xml:space="preserve"> </w:t>
+        <w:t xml:space="preserve">structured, AMR-specific extraction, a knowledge graph, and</w:t>
       </w:r>
       <w:r>
         <w:rPr>
           <w:b/>
           <w:bCs/>
         </w:rPr>
-        <w:t xml:space="preserve">Funding:</w:t>
-      </w:r>
-      <w:r>
-        <w:t xml:space="preserve"> </w:t>
-      </w:r>
-      <w:r>
-        <w:rPr>
-          <w:i/>
-          <w:iCs/>
-        </w:rPr>
-        <w:t xml:space="preserve">[fill]</w:t>
-      </w:r>
-      <w:r>
-        <w:t xml:space="preserve">.</w:t>
-      </w:r>
-      <w:r>
         <w:t xml:space="preserve"> </w:t>
       </w:r>
       <w:r>
@@ -974,35 +1832,232 @@
           <w:b/>
           <w:bCs/>
         </w:rPr>
-        <w:t xml:space="preserve">Competing interests:</w:t>
-      </w:r>
-      <w:r>
-        <w:t xml:space="preserve"> </w:t>
-      </w:r>
-      <w:r>
-        <w:t xml:space="preserve">none declared.</w:t>
-      </w:r>
-      <w:r>
-        <w:t xml:space="preserve"> </w:t>
-      </w:r>
+        <w:t xml:space="preserve">validation against reference resistance data</w:t>
+      </w:r>
+      <w:r>
+        <w:t xml:space="preserve">, all fully open and reproducible.</w:t>
+      </w:r>
+      <w:r>
+        <w:t xml:space="preserve"> </w:t>
+      </w:r>
+      <w:r>
+        <w:t xml:space="preserve">Its most striking early observation — that raw open-source literature signal is</w:t>
+      </w:r>
+      <w:r>
+        <w:t xml:space="preserve"> </w:t>
+      </w:r>
+      <w:r>
+        <w:t xml:space="preserve">uncorrelated with measured resistance and inversely associated with where</w:t>
+      </w:r>
+      <w:r>
+        <w:t xml:space="preserve"> </w:t>
+      </w:r>
+      <w:r>
+        <w:t xml:space="preserve">outbreaks are officially reported — is itself a substantive finding: naïve</w:t>
+      </w:r>
+      <w:r>
+        <w:t xml:space="preserve"> </w:t>
+      </w:r>
+      <w:r>
+        <w:t xml:space="preserve">text-volume indicators would misrank global risk, and any credible early-warning</w:t>
+      </w:r>
+      <w:r>
+        <w:t xml:space="preserve"> </w:t>
+      </w:r>
+      <w:r>
+        <w:t xml:space="preserve">model must correct for reporting and publication bias. By quantifying this gap</w:t>
+      </w:r>
+      <w:r>
+        <w:t xml:space="preserve"> </w:t>
+      </w:r>
+      <w:r>
+        <w:t xml:space="preserve">against WHO reference data, VIGIL turns a known caveat into a measurable target.</w:t>
+      </w:r>
+    </w:p>
+    <w:p>
+      <w:pPr>
+        <w:pStyle w:val="BodyText"/>
+      </w:pPr>
+      <w:r>
+        <w:t xml:space="preserve">The platform is also designed as research infrastructure. Because it stores both</w:t>
+      </w:r>
+      <w:r>
+        <w:t xml:space="preserve"> </w:t>
+      </w:r>
+      <w:r>
+        <w:t xml:space="preserve">rule-based and LLM outputs with full provenance and ships a frozen annotation</w:t>
+      </w:r>
+      <w:r>
+        <w:t xml:space="preserve"> </w:t>
+      </w:r>
+      <w:r>
+        <w:t xml:space="preserve">codebook, it directly enables a clinician-annotated benchmark of open LLMs for</w:t>
+      </w:r>
+      <w:r>
+        <w:t xml:space="preserve"> </w:t>
+      </w:r>
+      <w:r>
+        <w:t xml:space="preserve">AMR extraction, and its accumulating time series supports early-warning modelling</w:t>
+      </w:r>
+      <w:r>
+        <w:t xml:space="preserve"> </w:t>
+      </w:r>
+      <w:r>
+        <w:t xml:space="preserve">with lead-time evaluation against GLASS. Its Asia-Pacific focus addresses a</w:t>
+      </w:r>
+      <w:r>
+        <w:t xml:space="preserve"> </w:t>
+      </w:r>
+      <w:r>
+        <w:t xml:space="preserve">region under-represented in existing tools.</w:t>
+      </w:r>
+    </w:p>
+    <w:bookmarkEnd w:id="23"/>
+    <w:bookmarkStart w:id="24" w:name="limitations"/>
+    <w:p>
+      <w:pPr>
+        <w:pStyle w:val="Heading2"/>
+      </w:pPr>
+      <w:r>
+        <w:t xml:space="preserve">5. Limitations</w:t>
+      </w:r>
+    </w:p>
+    <w:p>
+      <w:pPr>
+        <w:pStyle w:val="FirstParagraph"/>
+      </w:pPr>
+      <w:r>
+        <w:t xml:space="preserve">The corpus is young, so trend, forecasting, and novelty analytics are preliminary</w:t>
+      </w:r>
+      <w:r>
+        <w:t xml:space="preserve"> </w:t>
+      </w:r>
+      <w:r>
+        <w:t xml:space="preserve">and strengthen with accumulated history. Text-derived geolocation reflects where</w:t>
+      </w:r>
+      <w:r>
+        <w:t xml:space="preserve"> </w:t>
+      </w:r>
+      <w:r>
+        <w:t xml:space="preserve">topics are reported or studied, not confirmed case counts, and is subject to</w:t>
+      </w:r>
+      <w:r>
+        <w:t xml:space="preserve"> </w:t>
+      </w:r>
+      <w:r>
+        <w:t xml:space="preserve">reporting and publication bias (which the platform surfaces rather than conceals).</w:t>
+      </w:r>
+      <w:r>
+        <w:t xml:space="preserve"> </w:t>
+      </w:r>
+      <w:r>
+        <w:t xml:space="preserve">Reference coverage is incomplete: WHO GHO does not list some territories,</w:t>
+      </w:r>
+      <w:r>
+        <w:t xml:space="preserve"> </w:t>
+      </w:r>
+      <w:r>
+        <w:t xml:space="preserve">including Taiwan (a listing limitation of the reference source, not a platform</w:t>
+      </w:r>
+      <w:r>
+        <w:t xml:space="preserve"> </w:t>
+      </w:r>
+      <w:r>
+        <w:t xml:space="preserve">merge), and lacks values for several countries on these indicators. LLM</w:t>
+      </w:r>
+      <w:r>
+        <w:t xml:space="preserve"> </w:t>
+      </w:r>
+      <w:r>
+        <w:t xml:space="preserve">extraction is currently constrained by free-tier throughput. Finally, the</w:t>
+      </w:r>
+      <w:r>
+        <w:t xml:space="preserve"> </w:t>
+      </w:r>
+      <w:r>
+        <w:t xml:space="preserve">extraction benchmark awaits full clinician annotation and a second annotator for</w:t>
+      </w:r>
+      <w:r>
+        <w:t xml:space="preserve"> </w:t>
+      </w:r>
+      <w:r>
+        <w:t xml:space="preserve">reliability estimation.</w:t>
+      </w:r>
+    </w:p>
+    <w:bookmarkEnd w:id="24"/>
+    <w:bookmarkStart w:id="25" w:name="conclusion"/>
+    <w:p>
+      <w:pPr>
+        <w:pStyle w:val="Heading2"/>
+      </w:pPr>
+      <w:r>
+        <w:t xml:space="preserve">6. Conclusion</w:t>
+      </w:r>
+    </w:p>
+    <w:p>
+      <w:pPr>
+        <w:pStyle w:val="FirstParagraph"/>
+      </w:pPr>
+      <w:r>
+        <w:t xml:space="preserve">VIGIL is an open, validation-first platform that converts open-source</w:t>
+      </w:r>
+      <w:r>
+        <w:t xml:space="preserve"> </w:t>
+      </w:r>
+      <w:r>
+        <w:t xml:space="preserve">infectious-disease and AMR text into structured, citable intelligence, and a</w:t>
+      </w:r>
+      <w:r>
+        <w:t xml:space="preserve"> </w:t>
+      </w:r>
+      <w:r>
+        <w:t xml:space="preserve">foundation for a program of methodological studies. It is freely available, runs</w:t>
+      </w:r>
+      <w:r>
+        <w:t xml:space="preserve"> </w:t>
+      </w:r>
+      <w:r>
+        <w:t xml:space="preserve">and updates at no cost, and is archived with a DOI for reuse and citation.</w:t>
+      </w:r>
+    </w:p>
+    <w:bookmarkEnd w:id="25"/>
+    <w:bookmarkStart w:id="26" w:name="declarations"/>
+    <w:p>
+      <w:pPr>
+        <w:pStyle w:val="Heading2"/>
+      </w:pPr>
+      <w:r>
+        <w:t xml:space="preserve">7. Declarations</w:t>
+      </w:r>
+    </w:p>
+    <w:p>
+      <w:pPr>
+        <w:pStyle w:val="FirstParagraph"/>
+      </w:pPr>
       <w:r>
         <w:rPr>
           <w:b/>
           <w:bCs/>
         </w:rPr>
-        <w:t xml:space="preserve">Ethics:</w:t>
-      </w:r>
-      <w:r>
-        <w:t xml:space="preserve"> </w:t>
-      </w:r>
-      <w:r>
-        <w:t xml:space="preserve">uses only open-source,</w:t>
-      </w:r>
-      <w:r>
-        <w:t xml:space="preserve"> </w:t>
-      </w:r>
-      <w:r>
-        <w:t xml:space="preserve">aggregate/public data; no individual patient data.</w:t>
+        <w:t xml:space="preserve">Data and code availability:</w:t>
+      </w:r>
+      <w:r>
+        <w:t xml:space="preserve"> </w:t>
+      </w:r>
+      <w:r>
+        <w:t xml:space="preserve">all code and the annotated schema are available on</w:t>
+      </w:r>
+      <w:r>
+        <w:t xml:space="preserve"> </w:t>
+      </w:r>
+      <w:r>
+        <w:t xml:space="preserve">GitHub and archived on Zenodo (DOI: 10.5281/zenodo.21263882); data derive from</w:t>
+      </w:r>
+      <w:r>
+        <w:t xml:space="preserve"> </w:t>
+      </w:r>
+      <w:r>
+        <w:t xml:space="preserve">public open-source APIs.</w:t>
       </w:r>
       <w:r>
         <w:t xml:space="preserve"> </w:t>
@@ -1012,23 +2067,97 @@
           <w:b/>
           <w:bCs/>
         </w:rPr>
+        <w:t xml:space="preserve">Funding:</w:t>
+      </w:r>
+      <w:r>
+        <w:t xml:space="preserve"> </w:t>
+      </w:r>
+      <w:r>
+        <w:t xml:space="preserve">none</w:t>
+      </w:r>
+      <w:r>
+        <w:t xml:space="preserve"> </w:t>
+      </w:r>
+      <w:r>
+        <w:rPr>
+          <w:rStyle w:val="VerbatimChar"/>
+        </w:rPr>
+        <w:t xml:space="preserve">[confirm/fill]</w:t>
+      </w:r>
+      <w:r>
+        <w:t xml:space="preserve">.</w:t>
+      </w:r>
+      <w:r>
+        <w:t xml:space="preserve"> </w:t>
+      </w:r>
+      <w:r>
+        <w:rPr>
+          <w:b/>
+          <w:bCs/>
+        </w:rPr>
+        <w:t xml:space="preserve">Competing</w:t>
+      </w:r>
+      <w:r>
+        <w:rPr>
+          <w:b/>
+          <w:bCs/>
+        </w:rPr>
+        <w:t xml:space="preserve"> </w:t>
+      </w:r>
+      <w:r>
+        <w:rPr>
+          <w:b/>
+          <w:bCs/>
+        </w:rPr>
+        <w:t xml:space="preserve">interests:</w:t>
+      </w:r>
+      <w:r>
+        <w:t xml:space="preserve"> </w:t>
+      </w:r>
+      <w:r>
+        <w:t xml:space="preserve">none declared.</w:t>
+      </w:r>
+      <w:r>
+        <w:t xml:space="preserve"> </w:t>
+      </w:r>
+      <w:r>
+        <w:rPr>
+          <w:b/>
+          <w:bCs/>
+        </w:rPr>
+        <w:t xml:space="preserve">Ethics:</w:t>
+      </w:r>
+      <w:r>
+        <w:t xml:space="preserve"> </w:t>
+      </w:r>
+      <w:r>
+        <w:t xml:space="preserve">the platform uses only open-source,</w:t>
+      </w:r>
+      <w:r>
+        <w:t xml:space="preserve"> </w:t>
+      </w:r>
+      <w:r>
+        <w:t xml:space="preserve">aggregate/public data and no individual patient data.</w:t>
+      </w:r>
+      <w:r>
+        <w:t xml:space="preserve"> </w:t>
+      </w:r>
+      <w:r>
+        <w:rPr>
+          <w:b/>
+          <w:bCs/>
+        </w:rPr>
         <w:t xml:space="preserve">Author contributions:</w:t>
       </w:r>
       <w:r>
         <w:t xml:space="preserve"> </w:t>
       </w:r>
       <w:r>
-        <w:t xml:space="preserve">YHW</w:t>
-      </w:r>
-      <w:r>
-        <w:t xml:space="preserve"> </w:t>
-      </w:r>
-      <w:r>
-        <w:t xml:space="preserve">conceived, built, and wrote.</w:t>
-      </w:r>
-    </w:p>
-    <w:bookmarkEnd w:id="23"/>
-    <w:bookmarkStart w:id="24" w:name="Xe07a37ba8723075a23c3e4138d6d46ac3399878"/>
+        <w:t xml:space="preserve">YHW conceived, designed, implemented, and wrote the work.</w:t>
+      </w:r>
+    </w:p>
+    <w:bookmarkEnd w:id="26"/>
+    <w:bookmarkStart w:id="27" w:name="Xe07a37ba8723075a23c3e4138d6d46ac3399878"/>
     <w:p>
       <w:pPr>
         <w:pStyle w:val="Heading2"/>
@@ -1070,7 +2199,7 @@
         </w:numPr>
       </w:pPr>
       <w:r>
-        <w:t xml:space="preserve">HealthMap. https://www.healthmap.org · ProMED-mail. https://promedmail.org · EPIWATCH (UNSW).</w:t>
+        <w:t xml:space="preserve">Freifeld CC, et al. HealthMap. https://www.healthmap.org</w:t>
       </w:r>
     </w:p>
     <w:p>
@@ -1082,7 +2211,7 @@
         </w:numPr>
       </w:pPr>
       <w:r>
-        <w:t xml:space="preserve">WHO Global Health Observatory OData API. https://www.who.int/data/gho/info/gho-odata-api</w:t>
+        <w:t xml:space="preserve">ProMED-mail, International Society for Infectious Diseases. https://promedmail.org</w:t>
       </w:r>
     </w:p>
     <w:p>
@@ -1094,7 +2223,16 @@
         </w:numPr>
       </w:pPr>
       <w:r>
-        <w:t xml:space="preserve">NCBI E-utilities; Europe PMC RESTful API; ClinicalTrials.gov API v2.</w:t>
+        <w:t xml:space="preserve">MacIntyre CR, et al. EPIWATCH (UNSW).</w:t>
+      </w:r>
+      <w:r>
+        <w:t xml:space="preserve"> </w:t>
+      </w:r>
+      <w:r>
+        <w:rPr>
+          <w:rStyle w:val="VerbatimChar"/>
+        </w:rPr>
+        <w:t xml:space="preserve">[ref]</w:t>
       </w:r>
     </w:p>
     <w:p>
@@ -1106,15 +2244,64 @@
         </w:numPr>
       </w:pPr>
       <w:r>
+        <w:t xml:space="preserve">WHO Global Health Observatory OData API. https://www.who.int/data/gho/info/gho-odata-api</w:t>
+      </w:r>
+    </w:p>
+    <w:p>
+      <w:pPr>
+        <w:pStyle w:val="Compact"/>
+        <w:numPr>
+          <w:ilvl w:val="0"/>
+          <w:numId w:val="1001"/>
+        </w:numPr>
+      </w:pPr>
+      <w:r>
+        <w:t xml:space="preserve">NCBI E-utilities; Europe PMC RESTful API; ClinicalTrials.gov API v2.</w:t>
+      </w:r>
+    </w:p>
+    <w:p>
+      <w:pPr>
+        <w:pStyle w:val="Compact"/>
+        <w:numPr>
+          <w:ilvl w:val="0"/>
+          <w:numId w:val="1001"/>
+        </w:numPr>
+      </w:pPr>
+      <w:r>
+        <w:rPr>
+          <w:rStyle w:val="VerbatimChar"/>
+        </w:rPr>
+        <w:t xml:space="preserve">[Add: GBD 2019 AMR burden (Murray CJL, et al., Lancet 2022); NLP/LLM for clinical/surveillance information extraction; open-LLM benchmarking.]</w:t>
+      </w:r>
+    </w:p>
+    <w:p>
+      <w:pPr>
+        <w:pStyle w:val="FirstParagraph"/>
+      </w:pPr>
+      <w:r>
         <w:rPr>
           <w:i/>
           <w:iCs/>
         </w:rPr>
-        <w:t xml:space="preserve">[Add: AMR burden (e.g. GBD AMR); NLP/LLM for clinical or surveillance information extraction; benchmarking of open LLMs.]</w:t>
-      </w:r>
-    </w:p>
-    <w:bookmarkEnd w:id="24"/>
-    <w:bookmarkEnd w:id="25"/>
+        <w:t xml:space="preserve">Figure 1. Platform architecture (collect → extract → entities/relations →</w:t>
+      </w:r>
+      <w:r>
+        <w:rPr>
+          <w:i/>
+          <w:iCs/>
+        </w:rPr>
+        <w:t xml:space="preserve"> </w:t>
+      </w:r>
+      <w:r>
+        <w:rPr>
+          <w:i/>
+          <w:iCs/>
+        </w:rPr>
+        <w:t xml:space="preserve">analyse → serve). [To be generated.]</w:t>
+      </w:r>
+    </w:p>
+    <w:bookmarkEnd w:id="27"/>
+    <w:bookmarkEnd w:id="28"/>
     <w:sectPr>
       <w:footnotePr>
         <w:numRestart w:val="eachSect"/>
@@ -1225,114 +2412,123 @@
       </w:pPr>
     </w:lvl>
   </w:abstractNum>
-  <w:abstractNum w:abstractNumId="991">
-    <w:nsid w:val="0000A991"/>
+  <w:abstractNum w:abstractNumId="99411">
+    <w:nsid w:val="00A99411"/>
     <w:multiLevelType w:val="multilevel"/>
     <w:lvl w:ilvl="0">
-      <w:numFmt w:val="bullet"/>
-      <w:lvlText w:val=""/>
+      <w:start w:val="1"/>
+      <w:numFmt w:val="decimal"/>
+      <w:lvlText w:val="%1."/>
       <w:lvlJc w:val="left"/>
       <w:pPr>
         <w:ind w:left="720" w:hanging="360"/>
       </w:pPr>
-      <w:rPr>
-        <w:rFonts w:ascii="Symbol" w:hAnsi="Symbol" w:cs="Symbol" w:hint="default"/>
-      </w:rPr>
     </w:lvl>
     <w:lvl w:ilvl="1">
-      <w:numFmt w:val="bullet"/>
-      <w:lvlText w:val="o"/>
+      <w:start w:val="1"/>
+      <w:numFmt w:val="decimal"/>
+      <w:lvlText w:val="%2."/>
       <w:lvlJc w:val="left"/>
       <w:pPr>
         <w:ind w:left="1440" w:hanging="360"/>
       </w:pPr>
-      <w:rPr>
-        <w:rFonts w:ascii="Courier New" w:hAnsi="Courier New" w:cs="Courier New" w:hint="default"/>
-      </w:rPr>
     </w:lvl>
     <w:lvl w:ilvl="2">
-      <w:numFmt w:val="bullet"/>
-      <w:lvlText w:val=""/>
+      <w:start w:val="1"/>
+      <w:numFmt w:val="decimal"/>
+      <w:lvlText w:val="%3."/>
       <w:lvlJc w:val="left"/>
       <w:pPr>
         <w:ind w:left="2160" w:hanging="360"/>
       </w:pPr>
-      <w:rPr>
-        <w:rFonts w:ascii="Wingdings" w:hAnsi="Wingdings" w:cs="Wingdings" w:hint="default"/>
-      </w:rPr>
     </w:lvl>
     <w:lvl w:ilvl="3">
-      <w:numFmt w:val="bullet"/>
-      <w:lvlText w:val=""/>
+      <w:start w:val="1"/>
+      <w:numFmt w:val="decimal"/>
+      <w:lvlText w:val="%4."/>
       <w:lvlJc w:val="left"/>
       <w:pPr>
         <w:ind w:left="2880" w:hanging="360"/>
       </w:pPr>
-      <w:rPr>
-        <w:rFonts w:ascii="Symbol" w:hAnsi="Symbol" w:cs="Symbol" w:hint="default"/>
-      </w:rPr>
     </w:lvl>
     <w:lvl w:ilvl="4">
-      <w:numFmt w:val="bullet"/>
-      <w:lvlText w:val="o"/>
+      <w:start w:val="1"/>
+      <w:numFmt w:val="decimal"/>
+      <w:lvlText w:val="%5."/>
       <w:lvlJc w:val="left"/>
       <w:pPr>
         <w:ind w:left="3600" w:hanging="360"/>
       </w:pPr>
-      <w:rPr>
-        <w:rFonts w:ascii="Courier New" w:hAnsi="Courier New" w:cs="Courier New" w:hint="default"/>
-      </w:rPr>
     </w:lvl>
     <w:lvl w:ilvl="5">
-      <w:numFmt w:val="bullet"/>
-      <w:lvlText w:val=""/>
+      <w:start w:val="1"/>
+      <w:numFmt w:val="decimal"/>
+      <w:lvlText w:val="%6."/>
       <w:lvlJc w:val="left"/>
       <w:pPr>
         <w:ind w:left="4320" w:hanging="360"/>
       </w:pPr>
-      <w:rPr>
-        <w:rFonts w:ascii="Wingdings" w:hAnsi="Wingdings" w:cs="Wingdings" w:hint="default"/>
-      </w:rPr>
     </w:lvl>
     <w:lvl w:ilvl="6">
-      <w:numFmt w:val="bullet"/>
-      <w:lvlText w:val=""/>
+      <w:start w:val="1"/>
+      <w:numFmt w:val="decimal"/>
+      <w:lvlText w:val="%7."/>
       <w:lvlJc w:val="left"/>
       <w:pPr>
         <w:ind w:left="5040" w:hanging="360"/>
       </w:pPr>
-      <w:rPr>
-        <w:rFonts w:ascii="Symbol" w:hAnsi="Symbol" w:cs="Symbol" w:hint="default"/>
-      </w:rPr>
     </w:lvl>
     <w:lvl w:ilvl="7">
-      <w:numFmt w:val="bullet"/>
-      <w:lvlText w:val="o"/>
+      <w:start w:val="1"/>
+      <w:numFmt w:val="decimal"/>
+      <w:lvlText w:val="%8."/>
       <w:lvlJc w:val="left"/>
       <w:pPr>
         <w:ind w:left="5760" w:hanging="360"/>
       </w:pPr>
-      <w:rPr>
-        <w:rFonts w:ascii="Courier New" w:hAnsi="Courier New" w:cs="Courier New" w:hint="default"/>
-      </w:rPr>
     </w:lvl>
     <w:lvl w:ilvl="8">
-      <w:numFmt w:val="bullet"/>
-      <w:lvlText w:val=""/>
+      <w:start w:val="1"/>
+      <w:numFmt w:val="decimal"/>
+      <w:lvlText w:val="%9."/>
       <w:lvlJc w:val="left"/>
       <w:pPr>
         <w:ind w:left="6480" w:hanging="360"/>
       </w:pPr>
-      <w:rPr>
-        <w:rFonts w:ascii="Wingdings" w:hAnsi="Wingdings" w:cs="Wingdings" w:hint="default"/>
-      </w:rPr>
     </w:lvl>
   </w:abstractNum>
   <w:num w:numId="1000">
     <w:abstractNumId w:val="990"/>
   </w:num>
   <w:num w:numId="1001">
-    <w:abstractNumId w:val="991"/>
+    <w:abstractNumId w:val="99411"/>
+    <w:lvlOverride w:ilvl="0">
+      <w:startOverride w:val="1"/>
+    </w:lvlOverride>
+    <w:lvlOverride w:ilvl="1">
+      <w:startOverride w:val="1"/>
+    </w:lvlOverride>
+    <w:lvlOverride w:ilvl="2">
+      <w:startOverride w:val="1"/>
+    </w:lvlOverride>
+    <w:lvlOverride w:ilvl="3">
+      <w:startOverride w:val="1"/>
+    </w:lvlOverride>
+    <w:lvlOverride w:ilvl="4">
+      <w:startOverride w:val="1"/>
+    </w:lvlOverride>
+    <w:lvlOverride w:ilvl="5">
+      <w:startOverride w:val="1"/>
+    </w:lvlOverride>
+    <w:lvlOverride w:ilvl="6">
+      <w:startOverride w:val="1"/>
+    </w:lvlOverride>
+    <w:lvlOverride w:ilvl="7">
+      <w:startOverride w:val="1"/>
+    </w:lvlOverride>
+    <w:lvlOverride w:ilvl="8">
+      <w:startOverride w:val="1"/>
+    </w:lvlOverride>
   </w:num>
 </w:numbering>
 </file>

</xml_diff>

<commit_message>
Add Figure 1 architecture diagram, embed in manuscript, Vancouver-format references, regenerate docx
</commit_message>
<xml_diff>
--- a/docs/VIGIL_preprint.docx
+++ b/docs/VIGIL_preprint.docx
@@ -28,7 +28,7 @@
         </w:p>
       </w:sdtContent>
     </w:sdt>
-    <w:bookmarkStart w:id="28" w:name="X600a2618c5c30508b60a79d3c8d16e8d9a48992"/>
+    <w:bookmarkStart w:id="31" w:name="X600a2618c5c30508b60a79d3c8d16e8d9a48992"/>
     <w:p>
       <w:pPr>
         <w:pStyle w:val="Heading1"/>
@@ -815,7 +815,7 @@
       </w:r>
     </w:p>
     <w:bookmarkEnd w:id="11"/>
-    <w:bookmarkStart w:id="18" w:name="implementation"/>
+    <w:bookmarkStart w:id="21" w:name="implementation"/>
     <w:p>
       <w:pPr>
         <w:pStyle w:val="Heading2"/>
@@ -824,7 +824,7 @@
         <w:t xml:space="preserve">2. Implementation</w:t>
       </w:r>
     </w:p>
-    <w:bookmarkStart w:id="12" w:name="overview-and-architecture"/>
+    <w:bookmarkStart w:id="15" w:name="overview-and-architecture"/>
     <w:p>
       <w:pPr>
         <w:pStyle w:val="Heading3"/>
@@ -895,8 +895,73 @@
         <w:t xml:space="preserve">traceable to source text and supports head-to-head comparison of extractors.</w:t>
       </w:r>
     </w:p>
-    <w:bookmarkEnd w:id="12"/>
-    <w:bookmarkStart w:id="13" w:name="data-sources"/>
+    <w:p>
+      <w:pPr>
+        <w:pStyle w:val="CaptionedFigure"/>
+      </w:pPr>
+      <w:r>
+        <w:drawing>
+          <wp:inline>
+            <wp:extent cx="5334000" cy="2244974"/>
+            <wp:effectExtent b="0" l="0" r="0" t="0"/>
+            <wp:docPr descr="Figure 1. VIGIL platform architecture: collect → extract → knowledge graph → analyse → serve, with full provenance stored at extraction and analytics validated against WHO GHO/GLASS reference data." title="" id="13" name="Picture"/>
+            <a:graphic>
+              <a:graphicData uri="http://schemas.openxmlformats.org/drawingml/2006/picture">
+                <pic:pic>
+                  <pic:nvPicPr>
+                    <pic:cNvPr descr="figure1_architecture.png" id="14" name="Picture"/>
+                    <pic:cNvPicPr>
+                      <a:picLocks noChangeArrowheads="1" noChangeAspect="1"/>
+                    </pic:cNvPicPr>
+                  </pic:nvPicPr>
+                  <pic:blipFill>
+                    <a:blip r:embed="rId12"/>
+                    <a:stretch>
+                      <a:fillRect/>
+                    </a:stretch>
+                  </pic:blipFill>
+                  <pic:spPr bwMode="auto">
+                    <a:xfrm>
+                      <a:off x="0" y="0"/>
+                      <a:ext cx="5334000" cy="2244974"/>
+                    </a:xfrm>
+                    <a:prstGeom prst="rect">
+                      <a:avLst/>
+                    </a:prstGeom>
+                    <a:noFill/>
+                    <a:ln w="9525">
+                      <a:noFill/>
+                      <a:headEnd/>
+                      <a:tailEnd/>
+                    </a:ln>
+                  </pic:spPr>
+                </pic:pic>
+              </a:graphicData>
+            </a:graphic>
+          </wp:inline>
+        </w:drawing>
+      </w:r>
+    </w:p>
+    <w:p>
+      <w:pPr>
+        <w:pStyle w:val="ImageCaption"/>
+      </w:pPr>
+      <w:r>
+        <w:rPr>
+          <w:b/>
+          <w:bCs/>
+        </w:rPr>
+        <w:t xml:space="preserve">Figure 1.</w:t>
+      </w:r>
+      <w:r>
+        <w:t xml:space="preserve"> </w:t>
+      </w:r>
+      <w:r>
+        <w:t xml:space="preserve">VIGIL platform architecture: collect → extract → knowledge graph → analyse → serve, with full provenance stored at extraction and analytics validated against WHO GHO/GLASS reference data.</w:t>
+      </w:r>
+    </w:p>
+    <w:bookmarkEnd w:id="15"/>
+    <w:bookmarkStart w:id="16" w:name="data-sources"/>
     <w:p>
       <w:pPr>
         <w:pStyle w:val="Heading3"/>
@@ -1280,8 +1345,8 @@
         </w:tc>
       </w:tr>
     </w:tbl>
-    <w:bookmarkEnd w:id="13"/>
-    <w:bookmarkStart w:id="14" w:name="information-extraction"/>
+    <w:bookmarkEnd w:id="16"/>
+    <w:bookmarkStart w:id="17" w:name="information-extraction"/>
     <w:p>
       <w:pPr>
         <w:pStyle w:val="Heading3"/>
@@ -1378,8 +1443,8 @@
         <w:t xml:space="preserve">context that the dictionary baseline did not.</w:t>
       </w:r>
     </w:p>
-    <w:bookmarkEnd w:id="14"/>
-    <w:bookmarkStart w:id="15" w:name="knowledge-graph-and-analytics"/>
+    <w:bookmarkEnd w:id="17"/>
+    <w:bookmarkStart w:id="18" w:name="knowledge-graph-and-analytics"/>
     <w:p>
       <w:pPr>
         <w:pStyle w:val="Heading3"/>
@@ -1450,8 +1515,8 @@
         <w:t xml:space="preserve">validation-first country risk signal; and (7) an outbreak module.</w:t>
       </w:r>
     </w:p>
-    <w:bookmarkEnd w:id="15"/>
-    <w:bookmarkStart w:id="16" w:name="validation-design"/>
+    <w:bookmarkEnd w:id="18"/>
+    <w:bookmarkStart w:id="19" w:name="validation-design"/>
     <w:p>
       <w:pPr>
         <w:pStyle w:val="Heading3"/>
@@ -1541,8 +1606,8 @@
         <w:t xml:space="preserve">a planned clinician-annotated extraction benchmark under leakage controls.</w:t>
       </w:r>
     </w:p>
-    <w:bookmarkEnd w:id="16"/>
-    <w:bookmarkStart w:id="17" w:name="availability-and-reproducibility"/>
+    <w:bookmarkEnd w:id="19"/>
+    <w:bookmarkStart w:id="20" w:name="availability-and-reproducibility"/>
     <w:p>
       <w:pPr>
         <w:pStyle w:val="Heading3"/>
@@ -1571,9 +1636,9 @@
         <w:t xml:space="preserve">codebook, and the schema are versioned; a single command reproduces the pipeline.</w:t>
       </w:r>
     </w:p>
-    <w:bookmarkEnd w:id="17"/>
-    <w:bookmarkEnd w:id="18"/>
-    <w:bookmarkStart w:id="22" w:name="results"/>
+    <w:bookmarkEnd w:id="20"/>
+    <w:bookmarkEnd w:id="21"/>
+    <w:bookmarkStart w:id="25" w:name="results"/>
     <w:p>
       <w:pPr>
         <w:pStyle w:val="Heading2"/>
@@ -1582,7 +1647,7 @@
         <w:t xml:space="preserve">3. Results</w:t>
       </w:r>
     </w:p>
-    <w:bookmarkStart w:id="19" w:name="corpus"/>
+    <w:bookmarkStart w:id="22" w:name="corpus"/>
     <w:p>
       <w:pPr>
         <w:pStyle w:val="Heading3"/>
@@ -1654,8 +1719,8 @@
         <w:t xml:space="preserve">2016–2023.</w:t>
       </w:r>
     </w:p>
-    <w:bookmarkEnd w:id="19"/>
-    <w:bookmarkStart w:id="20" w:name="Xfe362eb0d94a590b7c669f8e7a55a7ca804140e"/>
+    <w:bookmarkEnd w:id="22"/>
+    <w:bookmarkStart w:id="23" w:name="Xfe362eb0d94a590b7c669f8e7a55a7ca804140e"/>
     <w:p>
       <w:pPr>
         <w:pStyle w:val="Heading3"/>
@@ -1702,8 +1767,8 @@
         <w:t xml:space="preserve">ceftazidime-avibactam), each traceable to the underlying documents.</w:t>
       </w:r>
     </w:p>
-    <w:bookmarkEnd w:id="20"/>
-    <w:bookmarkStart w:id="21" w:name="preliminary-validation"/>
+    <w:bookmarkEnd w:id="23"/>
+    <w:bookmarkStart w:id="24" w:name="preliminary-validation"/>
     <w:p>
       <w:pPr>
         <w:pStyle w:val="Heading3"/>
@@ -1780,9 +1845,9 @@
         <w:t xml:space="preserve">platform’s ability to make the surveillance gap explicit and measurable.</w:t>
       </w:r>
     </w:p>
-    <w:bookmarkEnd w:id="21"/>
-    <w:bookmarkEnd w:id="22"/>
-    <w:bookmarkStart w:id="23" w:name="discussion"/>
+    <w:bookmarkEnd w:id="24"/>
+    <w:bookmarkEnd w:id="25"/>
+    <w:bookmarkStart w:id="26" w:name="discussion"/>
     <w:p>
       <w:pPr>
         <w:pStyle w:val="Heading2"/>
@@ -1912,8 +1977,8 @@
         <w:t xml:space="preserve">region under-represented in existing tools.</w:t>
       </w:r>
     </w:p>
-    <w:bookmarkEnd w:id="23"/>
-    <w:bookmarkStart w:id="24" w:name="limitations"/>
+    <w:bookmarkEnd w:id="26"/>
+    <w:bookmarkStart w:id="27" w:name="limitations"/>
     <w:p>
       <w:pPr>
         <w:pStyle w:val="Heading2"/>
@@ -1984,8 +2049,8 @@
         <w:t xml:space="preserve">reliability estimation.</w:t>
       </w:r>
     </w:p>
-    <w:bookmarkEnd w:id="24"/>
-    <w:bookmarkStart w:id="25" w:name="conclusion"/>
+    <w:bookmarkEnd w:id="27"/>
+    <w:bookmarkStart w:id="28" w:name="conclusion"/>
     <w:p>
       <w:pPr>
         <w:pStyle w:val="Heading2"/>
@@ -2020,8 +2085,8 @@
         <w:t xml:space="preserve">and updates at no cost, and is archived with a DOI for reuse and citation.</w:t>
       </w:r>
     </w:p>
-    <w:bookmarkEnd w:id="25"/>
-    <w:bookmarkStart w:id="26" w:name="declarations"/>
+    <w:bookmarkEnd w:id="28"/>
+    <w:bookmarkStart w:id="29" w:name="declarations"/>
     <w:p>
       <w:pPr>
         <w:pStyle w:val="Heading2"/>
@@ -2156,14 +2221,69 @@
         <w:t xml:space="preserve">YHW conceived, designed, implemented, and wrote the work.</w:t>
       </w:r>
     </w:p>
-    <w:bookmarkEnd w:id="26"/>
-    <w:bookmarkStart w:id="27" w:name="Xe07a37ba8723075a23c3e4138d6d46ac3399878"/>
+    <w:bookmarkEnd w:id="29"/>
+    <w:bookmarkStart w:id="30" w:name="references"/>
     <w:p>
       <w:pPr>
         <w:pStyle w:val="Heading2"/>
       </w:pPr>
       <w:r>
-        <w:t xml:space="preserve">8. References (verify &amp; complete before submission)</w:t>
+        <w:t xml:space="preserve">8. References</w:t>
+      </w:r>
+    </w:p>
+    <w:p>
+      <w:pPr>
+        <w:pStyle w:val="FirstParagraph"/>
+      </w:pPr>
+      <w:r>
+        <w:rPr>
+          <w:i/>
+          <w:iCs/>
+        </w:rPr>
+        <w:t xml:space="preserve">Vancouver style. Entries marked</w:t>
+      </w:r>
+      <w:r>
+        <w:rPr>
+          <w:i/>
+          <w:iCs/>
+        </w:rPr>
+        <w:t xml:space="preserve"> </w:t>
+      </w:r>
+      <w:r>
+        <w:rPr>
+          <w:rStyle w:val="VerbatimChar"/>
+          <w:i/>
+          <w:iCs/>
+        </w:rPr>
+        <w:t xml:space="preserve">[verify]</w:t>
+      </w:r>
+      <w:r>
+        <w:rPr>
+          <w:i/>
+          <w:iCs/>
+        </w:rPr>
+        <w:t xml:space="preserve"> </w:t>
+      </w:r>
+      <w:r>
+        <w:rPr>
+          <w:i/>
+          <w:iCs/>
+        </w:rPr>
+        <w:t xml:space="preserve">should be checked against the</w:t>
+      </w:r>
+      <w:r>
+        <w:rPr>
+          <w:i/>
+          <w:iCs/>
+        </w:rPr>
+        <w:t xml:space="preserve"> </w:t>
+      </w:r>
+      <w:r>
+        <w:rPr>
+          <w:i/>
+          <w:iCs/>
+        </w:rPr>
+        <w:t xml:space="preserve">original before submission; add the empirical AMR/NLP references noted at the end.</w:t>
       </w:r>
     </w:p>
     <w:p>
@@ -2175,7 +2295,16 @@
         </w:numPr>
       </w:pPr>
       <w:r>
-        <w:t xml:space="preserve">WHO. Global Antimicrobial Resistance and Use Surveillance System (GLASS). https://www.who.int/initiatives/glass</w:t>
+        <w:t xml:space="preserve">Antimicrobial Resistance Collaborators. Global burden of bacterial antimicrobial resistance in 2019: a systematic analysis. Lancet. 2022;399(10325):629-655.</w:t>
+      </w:r>
+      <w:r>
+        <w:t xml:space="preserve"> </w:t>
+      </w:r>
+      <w:r>
+        <w:rPr>
+          <w:rStyle w:val="VerbatimChar"/>
+        </w:rPr>
+        <w:t xml:space="preserve">[verify pages]</w:t>
       </w:r>
     </w:p>
     <w:p>
@@ -2187,7 +2316,7 @@
         </w:numPr>
       </w:pPr>
       <w:r>
-        <w:t xml:space="preserve">WHO. Epidemic Intelligence from Open Sources (EIOS). https://www.who.int/initiatives/eios</w:t>
+        <w:t xml:space="preserve">World Health Organization. Global Antimicrobial Resistance and Use Surveillance System (GLASS) [Internet]. Geneva: WHO; [cited 2026 Jul 8]. Available from: https://www.who.int/initiatives/glass</w:t>
       </w:r>
     </w:p>
     <w:p>
@@ -2199,7 +2328,7 @@
         </w:numPr>
       </w:pPr>
       <w:r>
-        <w:t xml:space="preserve">Freifeld CC, et al. HealthMap. https://www.healthmap.org</w:t>
+        <w:t xml:space="preserve">World Health Organization. Epidemic Intelligence from Open Sources (EIOS) [Internet]. Geneva: WHO; [cited 2026 Jul 8]. Available from: https://www.who.int/initiatives/eios</w:t>
       </w:r>
     </w:p>
     <w:p>
@@ -2211,7 +2340,16 @@
         </w:numPr>
       </w:pPr>
       <w:r>
-        <w:t xml:space="preserve">ProMED-mail, International Society for Infectious Diseases. https://promedmail.org</w:t>
+        <w:t xml:space="preserve">Freifeld CC, Mandl KD, Reis BY, Brownstein JS. HealthMap: global infectious disease monitoring through automated classification and visualization of Internet media reports. J Am Med Inform Assoc. 2008;15(2):150-157.</w:t>
+      </w:r>
+      <w:r>
+        <w:t xml:space="preserve"> </w:t>
+      </w:r>
+      <w:r>
+        <w:rPr>
+          <w:rStyle w:val="VerbatimChar"/>
+        </w:rPr>
+        <w:t xml:space="preserve">[verify]</w:t>
       </w:r>
     </w:p>
     <w:p>
@@ -2223,16 +2361,7 @@
         </w:numPr>
       </w:pPr>
       <w:r>
-        <w:t xml:space="preserve">MacIntyre CR, et al. EPIWATCH (UNSW).</w:t>
-      </w:r>
-      <w:r>
-        <w:t xml:space="preserve"> </w:t>
-      </w:r>
-      <w:r>
-        <w:rPr>
-          <w:rStyle w:val="VerbatimChar"/>
-        </w:rPr>
-        <w:t xml:space="preserve">[ref]</w:t>
+        <w:t xml:space="preserve">International Society for Infectious Diseases. ProMED-mail [Internet]. [cited 2026 Jul 8]. Available from: https://promedmail.org</w:t>
       </w:r>
     </w:p>
     <w:p>
@@ -2244,7 +2373,16 @@
         </w:numPr>
       </w:pPr>
       <w:r>
-        <w:t xml:space="preserve">WHO Global Health Observatory OData API. https://www.who.int/data/gho/info/gho-odata-api</w:t>
+        <w:t xml:space="preserve">MacIntyre CR, et al. EPIWATCH: open-source epidemic observatory [Internet]. Sydney: UNSW; [cited 2026 Jul 8]. Available from: https://www.epiwatch.org</w:t>
+      </w:r>
+      <w:r>
+        <w:t xml:space="preserve"> </w:t>
+      </w:r>
+      <w:r>
+        <w:rPr>
+          <w:rStyle w:val="VerbatimChar"/>
+        </w:rPr>
+        <w:t xml:space="preserve">[verify author/title]</w:t>
       </w:r>
     </w:p>
     <w:p>
@@ -2256,7 +2394,7 @@
         </w:numPr>
       </w:pPr>
       <w:r>
-        <w:t xml:space="preserve">NCBI E-utilities; Europe PMC RESTful API; ClinicalTrials.gov API v2.</w:t>
+        <w:t xml:space="preserve">World Health Organization. Global Health Observatory OData API [Internet]. Geneva: WHO; [cited 2026 Jul 8]. Available from: https://www.who.int/data/gho/info/gho-odata-api</w:t>
       </w:r>
     </w:p>
     <w:p>
@@ -2268,10 +2406,31 @@
         </w:numPr>
       </w:pPr>
       <w:r>
-        <w:rPr>
-          <w:rStyle w:val="VerbatimChar"/>
-        </w:rPr>
-        <w:t xml:space="preserve">[Add: GBD 2019 AMR burden (Murray CJL, et al., Lancet 2022); NLP/LLM for clinical/surveillance information extraction; open-LLM benchmarking.]</w:t>
+        <w:t xml:space="preserve">National Center for Biotechnology Information. Entrez Programming Utilities (E-utilities) [Internet]. Bethesda (MD): NCBI; [cited 2026 Jul 8]. Available from: https://www.ncbi.nlm.nih.gov/books/NBK25501/</w:t>
+      </w:r>
+    </w:p>
+    <w:p>
+      <w:pPr>
+        <w:pStyle w:val="Compact"/>
+        <w:numPr>
+          <w:ilvl w:val="0"/>
+          <w:numId w:val="1001"/>
+        </w:numPr>
+      </w:pPr>
+      <w:r>
+        <w:t xml:space="preserve">Europe PMC Consortium. Europe PMC RESTful Web Service [Internet]. [cited 2026 Jul 8]. Available from: https://europepmc.org/RestfulWebService</w:t>
+      </w:r>
+    </w:p>
+    <w:p>
+      <w:pPr>
+        <w:pStyle w:val="Compact"/>
+        <w:numPr>
+          <w:ilvl w:val="0"/>
+          <w:numId w:val="1001"/>
+        </w:numPr>
+      </w:pPr>
+      <w:r>
+        <w:t xml:space="preserve">National Library of Medicine. ClinicalTrials.gov API [Internet]. Bethesda (MD): NLM; [cited 2026 Jul 8]. Available from: https://clinicaltrials.gov/data-api/api</w:t>
       </w:r>
     </w:p>
     <w:p>
@@ -2283,7 +2442,7 @@
           <w:i/>
           <w:iCs/>
         </w:rPr>
-        <w:t xml:space="preserve">Figure 1. Platform architecture (collect → extract → entities/relations →</w:t>
+        <w:t xml:space="preserve">To add before submission: 1–3 references on NLP/large-language-model information</w:t>
       </w:r>
       <w:r>
         <w:rPr>
@@ -2297,11 +2456,25 @@
           <w:i/>
           <w:iCs/>
         </w:rPr>
-        <w:t xml:space="preserve">analyse → serve). [To be generated.]</w:t>
-      </w:r>
-    </w:p>
-    <w:bookmarkEnd w:id="27"/>
-    <w:bookmarkEnd w:id="28"/>
+        <w:t xml:space="preserve">extraction in clinical or public-health surveillance, and on benchmarking of open</w:t>
+      </w:r>
+      <w:r>
+        <w:rPr>
+          <w:i/>
+          <w:iCs/>
+        </w:rPr>
+        <w:t xml:space="preserve"> </w:t>
+      </w:r>
+      <w:r>
+        <w:rPr>
+          <w:i/>
+          <w:iCs/>
+        </w:rPr>
+        <w:t xml:space="preserve">LLMs, to support the Background and Discussion.</w:t>
+      </w:r>
+    </w:p>
+    <w:bookmarkEnd w:id="30"/>
+    <w:bookmarkEnd w:id="31"/>
     <w:sectPr>
       <w:footnotePr>
         <w:numRestart w:val="eachSect"/>

</xml_diff>

<commit_message>
Add Figure 2 (validation scatter), Figure 3 (knowledge graph), Figure 4 (dashboard); embed all in manuscript + docx
</commit_message>
<xml_diff>
--- a/docs/VIGIL_preprint.docx
+++ b/docs/VIGIL_preprint.docx
@@ -28,7 +28,7 @@
         </w:p>
       </w:sdtContent>
     </w:sdt>
-    <w:bookmarkStart w:id="31" w:name="X600a2618c5c30508b60a79d3c8d16e8d9a48992"/>
+    <w:bookmarkStart w:id="40" w:name="X600a2618c5c30508b60a79d3c8d16e8d9a48992"/>
     <w:p>
       <w:pPr>
         <w:pStyle w:val="Heading1"/>
@@ -815,7 +815,7 @@
       </w:r>
     </w:p>
     <w:bookmarkEnd w:id="11"/>
-    <w:bookmarkStart w:id="21" w:name="implementation"/>
+    <w:bookmarkStart w:id="24" w:name="implementation"/>
     <w:p>
       <w:pPr>
         <w:pStyle w:val="Heading2"/>
@@ -1607,7 +1607,7 @@
       </w:r>
     </w:p>
     <w:bookmarkEnd w:id="19"/>
-    <w:bookmarkStart w:id="20" w:name="availability-and-reproducibility"/>
+    <w:bookmarkStart w:id="23" w:name="availability-and-reproducibility"/>
     <w:p>
       <w:pPr>
         <w:pStyle w:val="Heading3"/>
@@ -1627,18 +1627,89 @@
         <w:t xml:space="preserve"> </w:t>
       </w:r>
       <w:r>
-        <w:t xml:space="preserve">live instance, and updated daily at no cost via continuous integration. Code, the</w:t>
-      </w:r>
-      <w:r>
-        <w:t xml:space="preserve"> </w:t>
-      </w:r>
-      <w:r>
-        <w:t xml:space="preserve">codebook, and the schema are versioned; a single command reproduces the pipeline.</w:t>
-      </w:r>
-    </w:p>
-    <w:bookmarkEnd w:id="20"/>
-    <w:bookmarkEnd w:id="21"/>
-    <w:bookmarkStart w:id="25" w:name="results"/>
+        <w:t xml:space="preserve">live instance (Figure 4), and updated daily at no cost via continuous</w:t>
+      </w:r>
+      <w:r>
+        <w:t xml:space="preserve"> </w:t>
+      </w:r>
+      <w:r>
+        <w:t xml:space="preserve">integration. Code, the codebook, and the schema are versioned; a single command</w:t>
+      </w:r>
+      <w:r>
+        <w:t xml:space="preserve"> </w:t>
+      </w:r>
+      <w:r>
+        <w:t xml:space="preserve">reproduces the pipeline.</w:t>
+      </w:r>
+    </w:p>
+    <w:p>
+      <w:pPr>
+        <w:pStyle w:val="CaptionedFigure"/>
+      </w:pPr>
+      <w:r>
+        <w:drawing>
+          <wp:inline>
+            <wp:extent cx="5334000" cy="2530302"/>
+            <wp:effectExtent b="0" l="0" r="0" t="0"/>
+            <wp:docPr descr="Figure 4. The VIGIL web dashboard (public live instance): daily-updated corpus metrics and highlights, with sidebar access to search, trend, knowledge-graph, forecast, signal, novelty, graph-query, heatmap, risk, and outbreak modules, plus the annotation and benchmark tools." title="" id="21" name="Picture"/>
+            <a:graphic>
+              <a:graphicData uri="http://schemas.openxmlformats.org/drawingml/2006/picture">
+                <pic:pic>
+                  <pic:nvPicPr>
+                    <pic:cNvPr descr="figure4_dashboard.png" id="22" name="Picture"/>
+                    <pic:cNvPicPr>
+                      <a:picLocks noChangeArrowheads="1" noChangeAspect="1"/>
+                    </pic:cNvPicPr>
+                  </pic:nvPicPr>
+                  <pic:blipFill>
+                    <a:blip r:embed="rId20"/>
+                    <a:stretch>
+                      <a:fillRect/>
+                    </a:stretch>
+                  </pic:blipFill>
+                  <pic:spPr bwMode="auto">
+                    <a:xfrm>
+                      <a:off x="0" y="0"/>
+                      <a:ext cx="5334000" cy="2530302"/>
+                    </a:xfrm>
+                    <a:prstGeom prst="rect">
+                      <a:avLst/>
+                    </a:prstGeom>
+                    <a:noFill/>
+                    <a:ln w="9525">
+                      <a:noFill/>
+                      <a:headEnd/>
+                      <a:tailEnd/>
+                    </a:ln>
+                  </pic:spPr>
+                </pic:pic>
+              </a:graphicData>
+            </a:graphic>
+          </wp:inline>
+        </w:drawing>
+      </w:r>
+    </w:p>
+    <w:p>
+      <w:pPr>
+        <w:pStyle w:val="ImageCaption"/>
+      </w:pPr>
+      <w:r>
+        <w:rPr>
+          <w:b/>
+          <w:bCs/>
+        </w:rPr>
+        <w:t xml:space="preserve">Figure 4.</w:t>
+      </w:r>
+      <w:r>
+        <w:t xml:space="preserve"> </w:t>
+      </w:r>
+      <w:r>
+        <w:t xml:space="preserve">The VIGIL web dashboard (public live instance): daily-updated corpus metrics and highlights, with sidebar access to search, trend, knowledge-graph, forecast, signal, novelty, graph-query, heatmap, risk, and outbreak modules, plus the annotation and benchmark tools.</w:t>
+      </w:r>
+    </w:p>
+    <w:bookmarkEnd w:id="23"/>
+    <w:bookmarkEnd w:id="24"/>
+    <w:bookmarkStart w:id="34" w:name="results"/>
     <w:p>
       <w:pPr>
         <w:pStyle w:val="Heading2"/>
@@ -1647,7 +1718,7 @@
         <w:t xml:space="preserve">3. Results</w:t>
       </w:r>
     </w:p>
-    <w:bookmarkStart w:id="22" w:name="corpus"/>
+    <w:bookmarkStart w:id="25" w:name="corpus"/>
     <w:p>
       <w:pPr>
         <w:pStyle w:val="Heading3"/>
@@ -1719,8 +1790,8 @@
         <w:t xml:space="preserve">2016–2023.</w:t>
       </w:r>
     </w:p>
-    <w:bookmarkEnd w:id="22"/>
-    <w:bookmarkStart w:id="23" w:name="Xfe362eb0d94a590b7c669f8e7a55a7ca804140e"/>
+    <w:bookmarkEnd w:id="25"/>
+    <w:bookmarkStart w:id="29" w:name="Xfe362eb0d94a590b7c669f8e7a55a7ca804140e"/>
     <w:p>
       <w:pPr>
         <w:pStyle w:val="Heading3"/>
@@ -1764,132 +1835,248 @@
         <w:t xml:space="preserve"> </w:t>
       </w:r>
       <w:r>
-        <w:t xml:space="preserve">ceftazidime-avibactam), each traceable to the underlying documents.</w:t>
-      </w:r>
-    </w:p>
-    <w:bookmarkEnd w:id="23"/>
-    <w:bookmarkStart w:id="24" w:name="preliminary-validation"/>
-    <w:p>
-      <w:pPr>
-        <w:pStyle w:val="Heading3"/>
-      </w:pPr>
-      <w:r>
-        <w:t xml:space="preserve">3.3 Preliminary validation</w:t>
-      </w:r>
-    </w:p>
-    <w:p>
-      <w:pPr>
-        <w:pStyle w:val="FirstParagraph"/>
-      </w:pPr>
-      <w:r>
-        <w:t xml:space="preserve">Across the 23 countries with both a platform AMR signal and a WHO GHO MRSA value,</w:t>
-      </w:r>
-      <w:r>
-        <w:t xml:space="preserve"> </w:t>
-      </w:r>
-      <w:r>
-        <w:t xml:space="preserve">raw document volume was essentially uncorrelated with measured resistance</w:t>
-      </w:r>
-      <w:r>
-        <w:t xml:space="preserve"> </w:t>
-      </w:r>
-      <w:r>
-        <w:t xml:space="preserve">(Spearman ρ = 0.06), whereas a publication-normalised AMR share showed a weak</w:t>
-      </w:r>
-      <w:r>
-        <w:t xml:space="preserve"> </w:t>
-      </w:r>
-      <w:r>
-        <w:t xml:space="preserve">positive association (ρ = 0.28) — consistent with document volume reflecting</w:t>
-      </w:r>
-      <w:r>
-        <w:t xml:space="preserve"> </w:t>
-      </w:r>
-      <w:r>
-        <w:t xml:space="preserve">research output rather than disease burden, and with normalisation partially</w:t>
-      </w:r>
-      <w:r>
-        <w:t xml:space="preserve"> </w:t>
-      </w:r>
-      <w:r>
-        <w:t xml:space="preserve">recovering signal. In the outbreak task (39 countries, 29 with an officially</w:t>
-      </w:r>
-      <w:r>
-        <w:t xml:space="preserve"> </w:t>
-      </w:r>
-      <w:r>
-        <w:t xml:space="preserve">reported outbreak), literature signal did not discriminate outbreak-affected</w:t>
-      </w:r>
-      <w:r>
-        <w:t xml:space="preserve"> </w:t>
-      </w:r>
-      <w:r>
-        <w:t xml:space="preserve">countries (rank-AUC = 0.16); reported outbreaks concentrated in low-literature,</w:t>
-      </w:r>
-      <w:r>
-        <w:t xml:space="preserve"> </w:t>
-      </w:r>
-      <w:r>
-        <w:t xml:space="preserve">lower-resource settings. These proof-of-concept results are preliminary and are</w:t>
-      </w:r>
-      <w:r>
-        <w:t xml:space="preserve"> </w:t>
-      </w:r>
-      <w:r>
-        <w:t xml:space="preserve">expected to sharpen as the corpus accumulates, but they already demonstrate the</w:t>
-      </w:r>
-      <w:r>
-        <w:t xml:space="preserve"> </w:t>
-      </w:r>
-      <w:r>
-        <w:t xml:space="preserve">platform’s ability to make the surveillance gap explicit and measurable.</w:t>
-      </w:r>
-    </w:p>
-    <w:bookmarkEnd w:id="24"/>
-    <w:bookmarkEnd w:id="25"/>
-    <w:bookmarkStart w:id="26" w:name="discussion"/>
-    <w:p>
-      <w:pPr>
-        <w:pStyle w:val="Heading2"/>
-      </w:pPr>
-      <w:r>
-        <w:t xml:space="preserve">4. Discussion</w:t>
-      </w:r>
-    </w:p>
-    <w:p>
-      <w:pPr>
-        <w:pStyle w:val="FirstParagraph"/>
-      </w:pPr>
-      <w:r>
-        <w:t xml:space="preserve">VIGIL complements, rather than duplicates, existing open-source</w:t>
-      </w:r>
-      <w:r>
-        <w:t xml:space="preserve"> </w:t>
-      </w:r>
-      <w:r>
-        <w:t xml:space="preserve">epidemic-intelligence systems: where those emphasise outbreak-event detection,</w:t>
-      </w:r>
-      <w:r>
-        <w:t xml:space="preserve"> </w:t>
-      </w:r>
-      <w:r>
-        <w:t xml:space="preserve">VIGIL emphasises</w:t>
-      </w:r>
-      <w:r>
-        <w:t xml:space="preserve"> </w:t>
-      </w:r>
+        <w:t xml:space="preserve">ceftazidime-avibactam), each traceable to the underlying documents (Figure 3).</w:t>
+      </w:r>
+    </w:p>
+    <w:p>
+      <w:pPr>
+        <w:pStyle w:val="CaptionedFigure"/>
+      </w:pPr>
+      <w:r>
+        <w:drawing>
+          <wp:inline>
+            <wp:extent cx="5334000" cy="4122592"/>
+            <wp:effectExtent b="0" l="0" r="0" t="0"/>
+            <wp:docPr descr="Figure 3. Knowledge-graph neighbourhood of carbapenem-resistant Enterobacterales (CRE) in the corpus: co-occurring countries, resistance genes, antibiotics, and clinical syndromes, each edge traceable to source documents." title="" id="27" name="Picture"/>
+            <a:graphic>
+              <a:graphicData uri="http://schemas.openxmlformats.org/drawingml/2006/picture">
+                <pic:pic>
+                  <pic:nvPicPr>
+                    <pic:cNvPr descr="figure3_kg.png" id="28" name="Picture"/>
+                    <pic:cNvPicPr>
+                      <a:picLocks noChangeArrowheads="1" noChangeAspect="1"/>
+                    </pic:cNvPicPr>
+                  </pic:nvPicPr>
+                  <pic:blipFill>
+                    <a:blip r:embed="rId26"/>
+                    <a:stretch>
+                      <a:fillRect/>
+                    </a:stretch>
+                  </pic:blipFill>
+                  <pic:spPr bwMode="auto">
+                    <a:xfrm>
+                      <a:off x="0" y="0"/>
+                      <a:ext cx="5334000" cy="4122592"/>
+                    </a:xfrm>
+                    <a:prstGeom prst="rect">
+                      <a:avLst/>
+                    </a:prstGeom>
+                    <a:noFill/>
+                    <a:ln w="9525">
+                      <a:noFill/>
+                      <a:headEnd/>
+                      <a:tailEnd/>
+                    </a:ln>
+                  </pic:spPr>
+                </pic:pic>
+              </a:graphicData>
+            </a:graphic>
+          </wp:inline>
+        </w:drawing>
+      </w:r>
+    </w:p>
+    <w:p>
+      <w:pPr>
+        <w:pStyle w:val="ImageCaption"/>
+      </w:pPr>
       <w:r>
         <w:rPr>
           <w:b/>
           <w:bCs/>
         </w:rPr>
-        <w:t xml:space="preserve">structured, AMR-specific extraction, a knowledge graph, and</w:t>
-      </w:r>
+        <w:t xml:space="preserve">Figure 3.</w:t>
+      </w:r>
+      <w:r>
+        <w:t xml:space="preserve"> </w:t>
+      </w:r>
+      <w:r>
+        <w:t xml:space="preserve">Knowledge-graph neighbourhood of carbapenem-resistant Enterobacterales (CRE) in the corpus: co-occurring countries, resistance genes, antibiotics, and clinical syndromes, each edge traceable to source documents.</w:t>
+      </w:r>
+    </w:p>
+    <w:bookmarkEnd w:id="29"/>
+    <w:bookmarkStart w:id="33" w:name="preliminary-validation"/>
+    <w:p>
+      <w:pPr>
+        <w:pStyle w:val="Heading3"/>
+      </w:pPr>
+      <w:r>
+        <w:t xml:space="preserve">3.3 Preliminary validation</w:t>
+      </w:r>
+    </w:p>
+    <w:p>
+      <w:pPr>
+        <w:pStyle w:val="FirstParagraph"/>
+      </w:pPr>
+      <w:r>
+        <w:t xml:space="preserve">Across the 23 countries with both a platform AMR signal and a WHO GHO MRSA value,</w:t>
+      </w:r>
+      <w:r>
+        <w:t xml:space="preserve"> </w:t>
+      </w:r>
+      <w:r>
+        <w:t xml:space="preserve">raw document volume was essentially uncorrelated with measured resistance</w:t>
+      </w:r>
+      <w:r>
+        <w:t xml:space="preserve"> </w:t>
+      </w:r>
+      <w:r>
+        <w:t xml:space="preserve">(Spearman ρ = 0.06), whereas a publication-normalised AMR share showed a weak</w:t>
+      </w:r>
+      <w:r>
+        <w:t xml:space="preserve"> </w:t>
+      </w:r>
+      <w:r>
+        <w:t xml:space="preserve">positive association (ρ = 0.28) — consistent with document volume reflecting</w:t>
+      </w:r>
+      <w:r>
+        <w:t xml:space="preserve"> </w:t>
+      </w:r>
+      <w:r>
+        <w:t xml:space="preserve">research output rather than disease burden, and with normalisation partially</w:t>
+      </w:r>
+      <w:r>
+        <w:t xml:space="preserve"> </w:t>
+      </w:r>
+      <w:r>
+        <w:t xml:space="preserve">recovering signal. In the outbreak task (39 countries, 29 with an officially</w:t>
+      </w:r>
+      <w:r>
+        <w:t xml:space="preserve"> </w:t>
+      </w:r>
+      <w:r>
+        <w:t xml:space="preserve">reported outbreak), literature signal did not discriminate outbreak-affected</w:t>
+      </w:r>
+      <w:r>
+        <w:t xml:space="preserve"> </w:t>
+      </w:r>
+      <w:r>
+        <w:t xml:space="preserve">countries (rank-AUC = 0.16); reported outbreaks concentrated in low-literature,</w:t>
+      </w:r>
+      <w:r>
+        <w:t xml:space="preserve"> </w:t>
+      </w:r>
+      <w:r>
+        <w:t xml:space="preserve">lower-resource settings. These proof-of-concept results are preliminary and are</w:t>
+      </w:r>
+      <w:r>
+        <w:t xml:space="preserve"> </w:t>
+      </w:r>
+      <w:r>
+        <w:t xml:space="preserve">expected to sharpen as the corpus accumulates, but they already demonstrate the</w:t>
+      </w:r>
+      <w:r>
+        <w:t xml:space="preserve"> </w:t>
+      </w:r>
+      <w:r>
+        <w:t xml:space="preserve">platform’s ability to make the surveillance gap explicit and measurable (Figure 2).</w:t>
+      </w:r>
+    </w:p>
+    <w:p>
+      <w:pPr>
+        <w:pStyle w:val="CaptionedFigure"/>
+      </w:pPr>
+      <w:r>
+        <w:drawing>
+          <wp:inline>
+            <wp:extent cx="5334000" cy="3849395"/>
+            <wp:effectExtent b="0" l="0" r="0" t="0"/>
+            <wp:docPr descr="Figure 2. Construct validity: per-country VIGIL platform AMR share versus WHO GHO measured MRSA bloodstream-infection resistance (%), across 23 countries. Raw document volume is essentially uncorrelated with measured resistance (Spearman ρ = 0.06); the publication-normalised AMR share shows a weak positive association (ρ = 0.28)." title="" id="31" name="Picture"/>
+            <a:graphic>
+              <a:graphicData uri="http://schemas.openxmlformats.org/drawingml/2006/picture">
+                <pic:pic>
+                  <pic:nvPicPr>
+                    <pic:cNvPr descr="figure2_validation.png" id="32" name="Picture"/>
+                    <pic:cNvPicPr>
+                      <a:picLocks noChangeArrowheads="1" noChangeAspect="1"/>
+                    </pic:cNvPicPr>
+                  </pic:nvPicPr>
+                  <pic:blipFill>
+                    <a:blip r:embed="rId30"/>
+                    <a:stretch>
+                      <a:fillRect/>
+                    </a:stretch>
+                  </pic:blipFill>
+                  <pic:spPr bwMode="auto">
+                    <a:xfrm>
+                      <a:off x="0" y="0"/>
+                      <a:ext cx="5334000" cy="3849395"/>
+                    </a:xfrm>
+                    <a:prstGeom prst="rect">
+                      <a:avLst/>
+                    </a:prstGeom>
+                    <a:noFill/>
+                    <a:ln w="9525">
+                      <a:noFill/>
+                      <a:headEnd/>
+                      <a:tailEnd/>
+                    </a:ln>
+                  </pic:spPr>
+                </pic:pic>
+              </a:graphicData>
+            </a:graphic>
+          </wp:inline>
+        </w:drawing>
+      </w:r>
+    </w:p>
+    <w:p>
+      <w:pPr>
+        <w:pStyle w:val="ImageCaption"/>
+      </w:pPr>
       <w:r>
         <w:rPr>
           <w:b/>
           <w:bCs/>
         </w:rPr>
+        <w:t xml:space="preserve">Figure 2.</w:t>
+      </w:r>
+      <w:r>
+        <w:t xml:space="preserve"> </w:t>
+      </w:r>
+      <w:r>
+        <w:t xml:space="preserve">Construct validity: per-country VIGIL platform AMR share versus WHO GHO measured MRSA bloodstream-infection resistance (%), across 23 countries. Raw document volume is essentially uncorrelated with measured resistance (Spearman ρ = 0.06); the publication-normalised AMR share shows a weak positive association (ρ = 0.28).</w:t>
+      </w:r>
+    </w:p>
+    <w:bookmarkEnd w:id="33"/>
+    <w:bookmarkEnd w:id="34"/>
+    <w:bookmarkStart w:id="35" w:name="discussion"/>
+    <w:p>
+      <w:pPr>
+        <w:pStyle w:val="Heading2"/>
+      </w:pPr>
+      <w:r>
+        <w:t xml:space="preserve">4. Discussion</w:t>
+      </w:r>
+    </w:p>
+    <w:p>
+      <w:pPr>
+        <w:pStyle w:val="FirstParagraph"/>
+      </w:pPr>
+      <w:r>
+        <w:t xml:space="preserve">VIGIL complements, rather than duplicates, existing open-source</w:t>
+      </w:r>
+      <w:r>
+        <w:t xml:space="preserve"> </w:t>
+      </w:r>
+      <w:r>
+        <w:t xml:space="preserve">epidemic-intelligence systems: where those emphasise outbreak-event detection,</w:t>
+      </w:r>
+      <w:r>
+        <w:t xml:space="preserve"> </w:t>
+      </w:r>
+      <w:r>
+        <w:t xml:space="preserve">VIGIL emphasises</w:t>
+      </w:r>
+      <w:r>
         <w:t xml:space="preserve"> </w:t>
       </w:r>
       <w:r>
@@ -1897,234 +2084,13 @@
           <w:b/>
           <w:bCs/>
         </w:rPr>
-        <w:t xml:space="preserve">validation against reference resistance data</w:t>
-      </w:r>
-      <w:r>
-        <w:t xml:space="preserve">, all fully open and reproducible.</w:t>
-      </w:r>
-      <w:r>
-        <w:t xml:space="preserve"> </w:t>
-      </w:r>
-      <w:r>
-        <w:t xml:space="preserve">Its most striking early observation — that raw open-source literature signal is</w:t>
-      </w:r>
-      <w:r>
-        <w:t xml:space="preserve"> </w:t>
-      </w:r>
-      <w:r>
-        <w:t xml:space="preserve">uncorrelated with measured resistance and inversely associated with where</w:t>
-      </w:r>
-      <w:r>
-        <w:t xml:space="preserve"> </w:t>
-      </w:r>
-      <w:r>
-        <w:t xml:space="preserve">outbreaks are officially reported — is itself a substantive finding: naïve</w:t>
-      </w:r>
-      <w:r>
-        <w:t xml:space="preserve"> </w:t>
-      </w:r>
-      <w:r>
-        <w:t xml:space="preserve">text-volume indicators would misrank global risk, and any credible early-warning</w:t>
-      </w:r>
-      <w:r>
-        <w:t xml:space="preserve"> </w:t>
-      </w:r>
-      <w:r>
-        <w:t xml:space="preserve">model must correct for reporting and publication bias. By quantifying this gap</w:t>
-      </w:r>
-      <w:r>
-        <w:t xml:space="preserve"> </w:t>
-      </w:r>
-      <w:r>
-        <w:t xml:space="preserve">against WHO reference data, VIGIL turns a known caveat into a measurable target.</w:t>
-      </w:r>
-    </w:p>
-    <w:p>
-      <w:pPr>
-        <w:pStyle w:val="BodyText"/>
-      </w:pPr>
-      <w:r>
-        <w:t xml:space="preserve">The platform is also designed as research infrastructure. Because it stores both</w:t>
-      </w:r>
-      <w:r>
-        <w:t xml:space="preserve"> </w:t>
-      </w:r>
-      <w:r>
-        <w:t xml:space="preserve">rule-based and LLM outputs with full provenance and ships a frozen annotation</w:t>
-      </w:r>
-      <w:r>
-        <w:t xml:space="preserve"> </w:t>
-      </w:r>
-      <w:r>
-        <w:t xml:space="preserve">codebook, it directly enables a clinician-annotated benchmark of open LLMs for</w:t>
-      </w:r>
-      <w:r>
-        <w:t xml:space="preserve"> </w:t>
-      </w:r>
-      <w:r>
-        <w:t xml:space="preserve">AMR extraction, and its accumulating time series supports early-warning modelling</w:t>
-      </w:r>
-      <w:r>
-        <w:t xml:space="preserve"> </w:t>
-      </w:r>
-      <w:r>
-        <w:t xml:space="preserve">with lead-time evaluation against GLASS. Its Asia-Pacific focus addresses a</w:t>
-      </w:r>
-      <w:r>
-        <w:t xml:space="preserve"> </w:t>
-      </w:r>
-      <w:r>
-        <w:t xml:space="preserve">region under-represented in existing tools.</w:t>
-      </w:r>
-    </w:p>
-    <w:bookmarkEnd w:id="26"/>
-    <w:bookmarkStart w:id="27" w:name="limitations"/>
-    <w:p>
-      <w:pPr>
-        <w:pStyle w:val="Heading2"/>
-      </w:pPr>
-      <w:r>
-        <w:t xml:space="preserve">5. Limitations</w:t>
-      </w:r>
-    </w:p>
-    <w:p>
-      <w:pPr>
-        <w:pStyle w:val="FirstParagraph"/>
-      </w:pPr>
-      <w:r>
-        <w:t xml:space="preserve">The corpus is young, so trend, forecasting, and novelty analytics are preliminary</w:t>
-      </w:r>
-      <w:r>
-        <w:t xml:space="preserve"> </w:t>
-      </w:r>
-      <w:r>
-        <w:t xml:space="preserve">and strengthen with accumulated history. Text-derived geolocation reflects where</w:t>
-      </w:r>
-      <w:r>
-        <w:t xml:space="preserve"> </w:t>
-      </w:r>
-      <w:r>
-        <w:t xml:space="preserve">topics are reported or studied, not confirmed case counts, and is subject to</w:t>
-      </w:r>
-      <w:r>
-        <w:t xml:space="preserve"> </w:t>
-      </w:r>
-      <w:r>
-        <w:t xml:space="preserve">reporting and publication bias (which the platform surfaces rather than conceals).</w:t>
-      </w:r>
-      <w:r>
-        <w:t xml:space="preserve"> </w:t>
-      </w:r>
-      <w:r>
-        <w:t xml:space="preserve">Reference coverage is incomplete: WHO GHO does not list some territories,</w:t>
-      </w:r>
-      <w:r>
-        <w:t xml:space="preserve"> </w:t>
-      </w:r>
-      <w:r>
-        <w:t xml:space="preserve">including Taiwan (a listing limitation of the reference source, not a platform</w:t>
-      </w:r>
-      <w:r>
-        <w:t xml:space="preserve"> </w:t>
-      </w:r>
-      <w:r>
-        <w:t xml:space="preserve">merge), and lacks values for several countries on these indicators. LLM</w:t>
-      </w:r>
-      <w:r>
-        <w:t xml:space="preserve"> </w:t>
-      </w:r>
-      <w:r>
-        <w:t xml:space="preserve">extraction is currently constrained by free-tier throughput. Finally, the</w:t>
-      </w:r>
-      <w:r>
-        <w:t xml:space="preserve"> </w:t>
-      </w:r>
-      <w:r>
-        <w:t xml:space="preserve">extraction benchmark awaits full clinician annotation and a second annotator for</w:t>
-      </w:r>
-      <w:r>
-        <w:t xml:space="preserve"> </w:t>
-      </w:r>
-      <w:r>
-        <w:t xml:space="preserve">reliability estimation.</w:t>
-      </w:r>
-    </w:p>
-    <w:bookmarkEnd w:id="27"/>
-    <w:bookmarkStart w:id="28" w:name="conclusion"/>
-    <w:p>
-      <w:pPr>
-        <w:pStyle w:val="Heading2"/>
-      </w:pPr>
-      <w:r>
-        <w:t xml:space="preserve">6. Conclusion</w:t>
-      </w:r>
-    </w:p>
-    <w:p>
-      <w:pPr>
-        <w:pStyle w:val="FirstParagraph"/>
-      </w:pPr>
-      <w:r>
-        <w:t xml:space="preserve">VIGIL is an open, validation-first platform that converts open-source</w:t>
-      </w:r>
-      <w:r>
-        <w:t xml:space="preserve"> </w:t>
-      </w:r>
-      <w:r>
-        <w:t xml:space="preserve">infectious-disease and AMR text into structured, citable intelligence, and a</w:t>
-      </w:r>
-      <w:r>
-        <w:t xml:space="preserve"> </w:t>
-      </w:r>
-      <w:r>
-        <w:t xml:space="preserve">foundation for a program of methodological studies. It is freely available, runs</w:t>
-      </w:r>
-      <w:r>
-        <w:t xml:space="preserve"> </w:t>
-      </w:r>
-      <w:r>
-        <w:t xml:space="preserve">and updates at no cost, and is archived with a DOI for reuse and citation.</w:t>
-      </w:r>
-    </w:p>
-    <w:bookmarkEnd w:id="28"/>
-    <w:bookmarkStart w:id="29" w:name="declarations"/>
-    <w:p>
-      <w:pPr>
-        <w:pStyle w:val="Heading2"/>
-      </w:pPr>
-      <w:r>
-        <w:t xml:space="preserve">7. Declarations</w:t>
-      </w:r>
-    </w:p>
-    <w:p>
-      <w:pPr>
-        <w:pStyle w:val="FirstParagraph"/>
-      </w:pPr>
+        <w:t xml:space="preserve">structured, AMR-specific extraction, a knowledge graph, and</w:t>
+      </w:r>
       <w:r>
         <w:rPr>
           <w:b/>
           <w:bCs/>
         </w:rPr>
-        <w:t xml:space="preserve">Data and code availability:</w:t>
-      </w:r>
-      <w:r>
-        <w:t xml:space="preserve"> </w:t>
-      </w:r>
-      <w:r>
-        <w:t xml:space="preserve">all code and the annotated schema are available on</w:t>
-      </w:r>
-      <w:r>
-        <w:t xml:space="preserve"> </w:t>
-      </w:r>
-      <w:r>
-        <w:t xml:space="preserve">GitHub and archived on Zenodo (DOI: 10.5281/zenodo.21263882); data derive from</w:t>
-      </w:r>
-      <w:r>
-        <w:t xml:space="preserve"> </w:t>
-      </w:r>
-      <w:r>
-        <w:t xml:space="preserve">public open-source APIs.</w:t>
-      </w:r>
-      <w:r>
         <w:t xml:space="preserve"> </w:t>
       </w:r>
       <w:r>
@@ -2132,41 +2098,262 @@
           <w:b/>
           <w:bCs/>
         </w:rPr>
-        <w:t xml:space="preserve">Funding:</w:t>
-      </w:r>
-      <w:r>
-        <w:t xml:space="preserve"> </w:t>
-      </w:r>
-      <w:r>
-        <w:t xml:space="preserve">none</w:t>
-      </w:r>
-      <w:r>
-        <w:t xml:space="preserve"> </w:t>
-      </w:r>
-      <w:r>
-        <w:rPr>
-          <w:rStyle w:val="VerbatimChar"/>
-        </w:rPr>
-        <w:t xml:space="preserve">[confirm/fill]</w:t>
-      </w:r>
-      <w:r>
-        <w:t xml:space="preserve">.</w:t>
-      </w:r>
-      <w:r>
-        <w:t xml:space="preserve"> </w:t>
-      </w:r>
+        <w:t xml:space="preserve">validation against reference resistance data</w:t>
+      </w:r>
+      <w:r>
+        <w:t xml:space="preserve">, all fully open and reproducible.</w:t>
+      </w:r>
+      <w:r>
+        <w:t xml:space="preserve"> </w:t>
+      </w:r>
+      <w:r>
+        <w:t xml:space="preserve">Its most striking early observation — that raw open-source literature signal is</w:t>
+      </w:r>
+      <w:r>
+        <w:t xml:space="preserve"> </w:t>
+      </w:r>
+      <w:r>
+        <w:t xml:space="preserve">uncorrelated with measured resistance and inversely associated with where</w:t>
+      </w:r>
+      <w:r>
+        <w:t xml:space="preserve"> </w:t>
+      </w:r>
+      <w:r>
+        <w:t xml:space="preserve">outbreaks are officially reported — is itself a substantive finding: naïve</w:t>
+      </w:r>
+      <w:r>
+        <w:t xml:space="preserve"> </w:t>
+      </w:r>
+      <w:r>
+        <w:t xml:space="preserve">text-volume indicators would misrank global risk, and any credible early-warning</w:t>
+      </w:r>
+      <w:r>
+        <w:t xml:space="preserve"> </w:t>
+      </w:r>
+      <w:r>
+        <w:t xml:space="preserve">model must correct for reporting and publication bias. By quantifying this gap</w:t>
+      </w:r>
+      <w:r>
+        <w:t xml:space="preserve"> </w:t>
+      </w:r>
+      <w:r>
+        <w:t xml:space="preserve">against WHO reference data, VIGIL turns a known caveat into a measurable target.</w:t>
+      </w:r>
+    </w:p>
+    <w:p>
+      <w:pPr>
+        <w:pStyle w:val="BodyText"/>
+      </w:pPr>
+      <w:r>
+        <w:t xml:space="preserve">The platform is also designed as research infrastructure. Because it stores both</w:t>
+      </w:r>
+      <w:r>
+        <w:t xml:space="preserve"> </w:t>
+      </w:r>
+      <w:r>
+        <w:t xml:space="preserve">rule-based and LLM outputs with full provenance and ships a frozen annotation</w:t>
+      </w:r>
+      <w:r>
+        <w:t xml:space="preserve"> </w:t>
+      </w:r>
+      <w:r>
+        <w:t xml:space="preserve">codebook, it directly enables a clinician-annotated benchmark of open LLMs for</w:t>
+      </w:r>
+      <w:r>
+        <w:t xml:space="preserve"> </w:t>
+      </w:r>
+      <w:r>
+        <w:t xml:space="preserve">AMR extraction, and its accumulating time series supports early-warning modelling</w:t>
+      </w:r>
+      <w:r>
+        <w:t xml:space="preserve"> </w:t>
+      </w:r>
+      <w:r>
+        <w:t xml:space="preserve">with lead-time evaluation against GLASS. Its Asia-Pacific focus addresses a</w:t>
+      </w:r>
+      <w:r>
+        <w:t xml:space="preserve"> </w:t>
+      </w:r>
+      <w:r>
+        <w:t xml:space="preserve">region under-represented in existing tools.</w:t>
+      </w:r>
+    </w:p>
+    <w:bookmarkEnd w:id="35"/>
+    <w:bookmarkStart w:id="36" w:name="limitations"/>
+    <w:p>
+      <w:pPr>
+        <w:pStyle w:val="Heading2"/>
+      </w:pPr>
+      <w:r>
+        <w:t xml:space="preserve">5. Limitations</w:t>
+      </w:r>
+    </w:p>
+    <w:p>
+      <w:pPr>
+        <w:pStyle w:val="FirstParagraph"/>
+      </w:pPr>
+      <w:r>
+        <w:t xml:space="preserve">The corpus is young, so trend, forecasting, and novelty analytics are preliminary</w:t>
+      </w:r>
+      <w:r>
+        <w:t xml:space="preserve"> </w:t>
+      </w:r>
+      <w:r>
+        <w:t xml:space="preserve">and strengthen with accumulated history. Text-derived geolocation reflects where</w:t>
+      </w:r>
+      <w:r>
+        <w:t xml:space="preserve"> </w:t>
+      </w:r>
+      <w:r>
+        <w:t xml:space="preserve">topics are reported or studied, not confirmed case counts, and is subject to</w:t>
+      </w:r>
+      <w:r>
+        <w:t xml:space="preserve"> </w:t>
+      </w:r>
+      <w:r>
+        <w:t xml:space="preserve">reporting and publication bias (which the platform surfaces rather than conceals).</w:t>
+      </w:r>
+      <w:r>
+        <w:t xml:space="preserve"> </w:t>
+      </w:r>
+      <w:r>
+        <w:t xml:space="preserve">Reference coverage is incomplete: WHO GHO does not list some territories,</w:t>
+      </w:r>
+      <w:r>
+        <w:t xml:space="preserve"> </w:t>
+      </w:r>
+      <w:r>
+        <w:t xml:space="preserve">including Taiwan (a listing limitation of the reference source, not a platform</w:t>
+      </w:r>
+      <w:r>
+        <w:t xml:space="preserve"> </w:t>
+      </w:r>
+      <w:r>
+        <w:t xml:space="preserve">merge), and lacks values for several countries on these indicators. LLM</w:t>
+      </w:r>
+      <w:r>
+        <w:t xml:space="preserve"> </w:t>
+      </w:r>
+      <w:r>
+        <w:t xml:space="preserve">extraction is currently constrained by free-tier throughput. Finally, the</w:t>
+      </w:r>
+      <w:r>
+        <w:t xml:space="preserve"> </w:t>
+      </w:r>
+      <w:r>
+        <w:t xml:space="preserve">extraction benchmark awaits full clinician annotation and a second annotator for</w:t>
+      </w:r>
+      <w:r>
+        <w:t xml:space="preserve"> </w:t>
+      </w:r>
+      <w:r>
+        <w:t xml:space="preserve">reliability estimation.</w:t>
+      </w:r>
+    </w:p>
+    <w:bookmarkEnd w:id="36"/>
+    <w:bookmarkStart w:id="37" w:name="conclusion"/>
+    <w:p>
+      <w:pPr>
+        <w:pStyle w:val="Heading2"/>
+      </w:pPr>
+      <w:r>
+        <w:t xml:space="preserve">6. Conclusion</w:t>
+      </w:r>
+    </w:p>
+    <w:p>
+      <w:pPr>
+        <w:pStyle w:val="FirstParagraph"/>
+      </w:pPr>
+      <w:r>
+        <w:t xml:space="preserve">VIGIL is an open, validation-first platform that converts open-source</w:t>
+      </w:r>
+      <w:r>
+        <w:t xml:space="preserve"> </w:t>
+      </w:r>
+      <w:r>
+        <w:t xml:space="preserve">infectious-disease and AMR text into structured, citable intelligence, and a</w:t>
+      </w:r>
+      <w:r>
+        <w:t xml:space="preserve"> </w:t>
+      </w:r>
+      <w:r>
+        <w:t xml:space="preserve">foundation for a program of methodological studies. It is freely available, runs</w:t>
+      </w:r>
+      <w:r>
+        <w:t xml:space="preserve"> </w:t>
+      </w:r>
+      <w:r>
+        <w:t xml:space="preserve">and updates at no cost, and is archived with a DOI for reuse and citation.</w:t>
+      </w:r>
+    </w:p>
+    <w:bookmarkEnd w:id="37"/>
+    <w:bookmarkStart w:id="38" w:name="declarations"/>
+    <w:p>
+      <w:pPr>
+        <w:pStyle w:val="Heading2"/>
+      </w:pPr>
+      <w:r>
+        <w:t xml:space="preserve">7. Declarations</w:t>
+      </w:r>
+    </w:p>
+    <w:p>
+      <w:pPr>
+        <w:pStyle w:val="FirstParagraph"/>
+      </w:pPr>
       <w:r>
         <w:rPr>
           <w:b/>
           <w:bCs/>
         </w:rPr>
-        <w:t xml:space="preserve">Competing</w:t>
+        <w:t xml:space="preserve">Data and code availability:</w:t>
+      </w:r>
+      <w:r>
+        <w:t xml:space="preserve"> </w:t>
+      </w:r>
+      <w:r>
+        <w:t xml:space="preserve">all code and the annotated schema are available on</w:t>
+      </w:r>
+      <w:r>
+        <w:t xml:space="preserve"> </w:t>
+      </w:r>
+      <w:r>
+        <w:t xml:space="preserve">GitHub and archived on Zenodo (DOI: 10.5281/zenodo.21263882); data derive from</w:t>
+      </w:r>
+      <w:r>
+        <w:t xml:space="preserve"> </w:t>
+      </w:r>
+      <w:r>
+        <w:t xml:space="preserve">public open-source APIs.</w:t>
+      </w:r>
+      <w:r>
+        <w:t xml:space="preserve"> </w:t>
       </w:r>
       <w:r>
         <w:rPr>
           <w:b/>
           <w:bCs/>
         </w:rPr>
+        <w:t xml:space="preserve">Funding:</w:t>
+      </w:r>
+      <w:r>
+        <w:t xml:space="preserve"> </w:t>
+      </w:r>
+      <w:r>
+        <w:t xml:space="preserve">none</w:t>
+      </w:r>
+      <w:r>
+        <w:t xml:space="preserve"> </w:t>
+      </w:r>
+      <w:r>
+        <w:rPr>
+          <w:rStyle w:val="VerbatimChar"/>
+        </w:rPr>
+        <w:t xml:space="preserve">[confirm/fill]</w:t>
+      </w:r>
+      <w:r>
+        <w:t xml:space="preserve">.</w:t>
+      </w:r>
+      <w:r>
         <w:t xml:space="preserve"> </w:t>
       </w:r>
       <w:r>
@@ -2174,37 +2361,13 @@
           <w:b/>
           <w:bCs/>
         </w:rPr>
-        <w:t xml:space="preserve">interests:</w:t>
-      </w:r>
-      <w:r>
-        <w:t xml:space="preserve"> </w:t>
-      </w:r>
-      <w:r>
-        <w:t xml:space="preserve">none declared.</w:t>
-      </w:r>
-      <w:r>
-        <w:t xml:space="preserve"> </w:t>
+        <w:t xml:space="preserve">Competing</w:t>
       </w:r>
       <w:r>
         <w:rPr>
           <w:b/>
           <w:bCs/>
         </w:rPr>
-        <w:t xml:space="preserve">Ethics:</w:t>
-      </w:r>
-      <w:r>
-        <w:t xml:space="preserve"> </w:t>
-      </w:r>
-      <w:r>
-        <w:t xml:space="preserve">the platform uses only open-source,</w:t>
-      </w:r>
-      <w:r>
-        <w:t xml:space="preserve"> </w:t>
-      </w:r>
-      <w:r>
-        <w:t xml:space="preserve">aggregate/public data and no individual patient data.</w:t>
-      </w:r>
-      <w:r>
         <w:t xml:space="preserve"> </w:t>
       </w:r>
       <w:r>
@@ -2212,6 +2375,44 @@
           <w:b/>
           <w:bCs/>
         </w:rPr>
+        <w:t xml:space="preserve">interests:</w:t>
+      </w:r>
+      <w:r>
+        <w:t xml:space="preserve"> </w:t>
+      </w:r>
+      <w:r>
+        <w:t xml:space="preserve">none declared.</w:t>
+      </w:r>
+      <w:r>
+        <w:t xml:space="preserve"> </w:t>
+      </w:r>
+      <w:r>
+        <w:rPr>
+          <w:b/>
+          <w:bCs/>
+        </w:rPr>
+        <w:t xml:space="preserve">Ethics:</w:t>
+      </w:r>
+      <w:r>
+        <w:t xml:space="preserve"> </w:t>
+      </w:r>
+      <w:r>
+        <w:t xml:space="preserve">the platform uses only open-source,</w:t>
+      </w:r>
+      <w:r>
+        <w:t xml:space="preserve"> </w:t>
+      </w:r>
+      <w:r>
+        <w:t xml:space="preserve">aggregate/public data and no individual patient data.</w:t>
+      </w:r>
+      <w:r>
+        <w:t xml:space="preserve"> </w:t>
+      </w:r>
+      <w:r>
+        <w:rPr>
+          <w:b/>
+          <w:bCs/>
+        </w:rPr>
         <w:t xml:space="preserve">Author contributions:</w:t>
       </w:r>
       <w:r>
@@ -2221,8 +2422,8 @@
         <w:t xml:space="preserve">YHW conceived, designed, implemented, and wrote the work.</w:t>
       </w:r>
     </w:p>
-    <w:bookmarkEnd w:id="29"/>
-    <w:bookmarkStart w:id="30" w:name="references"/>
+    <w:bookmarkEnd w:id="38"/>
+    <w:bookmarkStart w:id="39" w:name="references"/>
     <w:p>
       <w:pPr>
         <w:pStyle w:val="Heading2"/>
@@ -2473,8 +2674,8 @@
         <w:t xml:space="preserve">LLMs, to support the Background and Discussion.</w:t>
       </w:r>
     </w:p>
-    <w:bookmarkEnd w:id="30"/>
-    <w:bookmarkEnd w:id="31"/>
+    <w:bookmarkEnd w:id="39"/>
+    <w:bookmarkEnd w:id="40"/>
     <w:sectPr>
       <w:footnotePr>
         <w:numRestart w:val="eachSect"/>

</xml_diff>